<commit_message>
Update GE2021 lecture materials to 2026 Fall render
- Replace chapter0-14 slides and lecture notes (html/pdf/docx) with the
  2026-fall render from cm-master-chad ge2021 master
- Remove stale per-chapter img/ folders (new outputs embed resources)
- WKU_GE2021: subtitle 2026 Fall, student performance link to new app

🗿 MoAI <email@mo.ai.kr>
</commit_message>
<xml_diff>
--- a/docs/Course/GE2021/03_Lecture_Note/LectureNote_Chad/PPT/chapter0/chapter0_note.docx
+++ b/docs/Course/GE2021/03_Lecture_Note/LectureNote_Chad/PPT/chapter0/chapter0_note.docx
@@ -15,7 +15,7 @@
         <w:pStyle w:val="Subtitle"/>
       </w:pPr>
       <w:r>
-        <w:t xml:space="preserve">GE2021 Research Technology, Spring 2025</w:t>
+        <w:t xml:space="preserve">GE2021 Research Technology, Fall 2026</w:t>
       </w:r>
     </w:p>
     <w:p>
@@ -31,16 +31,16 @@
         <w:pStyle w:val="Date"/>
       </w:pPr>
       <w:r>
-        <w:t xml:space="preserve">Tue, 27 May 2025</w:t>
-      </w:r>
-    </w:p>
-    <w:bookmarkStart w:id="22" w:name="learning-objectives"/>
+        <w:t xml:space="preserve">Tue, 15 September 2026</w:t>
+      </w:r>
+    </w:p>
+    <w:bookmarkStart w:id="22" w:name="todays-agenda"/>
     <w:p>
       <w:pPr>
         <w:pStyle w:val="Heading1"/>
       </w:pPr>
       <w:r>
-        <w:t xml:space="preserve">Learning Objectives</w:t>
+        <w:t xml:space="preserve">Today’s Agenda</w:t>
       </w:r>
     </w:p>
     <w:p>
@@ -76,7 +76,7 @@
         </w:numPr>
       </w:pPr>
       <w:r>
-        <w:t xml:space="preserve">Course Information and Syllabus</w:t>
+        <w:t xml:space="preserve">Course Information</w:t>
       </w:r>
     </w:p>
     <w:p>
@@ -127,7 +127,7 @@
     </w:p>
     <w:bookmarkEnd w:id="21"/>
     <w:bookmarkEnd w:id="22"/>
-    <w:bookmarkStart w:id="41" w:name="instructor"/>
+    <w:bookmarkStart w:id="28" w:name="instructor"/>
     <w:p>
       <w:pPr>
         <w:pStyle w:val="Heading1"/>
@@ -146,18 +146,6 @@
       </w:pPr>
       <w:r>
         <w:t xml:space="preserve">Professor</w:t>
-      </w:r>
-    </w:p>
-    <w:p>
-      <w:pPr>
-        <w:pStyle w:val="Compact"/>
-        <w:numPr>
-          <w:ilvl w:val="0"/>
-          <w:numId w:val="1002"/>
-        </w:numPr>
-      </w:pPr>
-      <w:r>
-        <w:t xml:space="preserve">Teaching Assitant</w:t>
       </w:r>
     </w:p>
     <w:bookmarkStart w:id="27" w:name="professor"/>
@@ -192,7 +180,7 @@
               <a:graphicData uri="http://schemas.openxmlformats.org/drawingml/2006/picture">
                 <pic:pic>
                   <pic:nvPicPr>
-                    <pic:cNvPr descr="img/chad.jpg" id="25" name="Picture"/>
+                    <pic:cNvPr descr="../../02_Assets/brand/chad.jpg" id="25" name="Picture"/>
                     <pic:cNvPicPr>
                       <a:picLocks noChangeArrowheads="1" noChangeAspect="1"/>
                     </pic:cNvPicPr>
@@ -272,7 +260,7 @@
           <w:i/>
           <w:iCs/>
         </w:rPr>
-        <w:t xml:space="preserve">Assistant Professor</w:t>
+        <w:t xml:space="preserve">Associate Professor</w:t>
       </w:r>
       <w:r>
         <w:t xml:space="preserve"> </w:t>
@@ -290,7 +278,7 @@
         </w:numPr>
       </w:pPr>
       <w:r>
-        <w:t xml:space="preserve">Call ma Chad, but in formal situation and space, Dr.Chae or Prof.Chae</w:t>
+        <w:t xml:space="preserve">Call me Chad, but in formal situation and space, Dr.Chae or Prof.Chae</w:t>
       </w:r>
     </w:p>
     <w:p>
@@ -355,1218 +343,1021 @@
     </w:p>
     <w:bookmarkEnd w:id="26"/>
     <w:bookmarkEnd w:id="27"/>
-    <w:bookmarkStart w:id="40" w:name="teaching-assistant"/>
+    <w:bookmarkEnd w:id="28"/>
+    <w:bookmarkStart w:id="43" w:name="course-introduction"/>
+    <w:p>
+      <w:pPr>
+        <w:pStyle w:val="Heading1"/>
+      </w:pPr>
+      <w:r>
+        <w:t xml:space="preserve">Course Introduction</w:t>
+      </w:r>
+    </w:p>
+    <w:p>
+      <w:pPr>
+        <w:pStyle w:val="Compact"/>
+        <w:numPr>
+          <w:ilvl w:val="0"/>
+          <w:numId w:val="1005"/>
+        </w:numPr>
+      </w:pPr>
+      <w:r>
+        <w:t xml:space="preserve">GE*2021 RESEARCH AND TECHNOLOGY (3 Credits)</w:t>
+      </w:r>
+    </w:p>
+    <w:p>
+      <w:pPr>
+        <w:pStyle w:val="Compact"/>
+        <w:numPr>
+          <w:ilvl w:val="1"/>
+          <w:numId w:val="1006"/>
+        </w:numPr>
+      </w:pPr>
+      <w:r>
+        <w:t xml:space="preserve">Introduction to the research process for students with majors in the College of Business and Public Management. Preparation of a formal research paper. Emphasizes the use of library resources and interdisciplinary approaches to designing, investigating, and reporting research activities. Writing Intensive.</w:t>
+      </w:r>
+    </w:p>
+    <w:bookmarkStart w:id="29" w:name="chapter-1-the-purpose-of-research"/>
     <w:p>
       <w:pPr>
         <w:pStyle w:val="Heading2"/>
       </w:pPr>
       <w:r>
-        <w:t xml:space="preserve">Teaching Assistant</w:t>
-      </w:r>
-    </w:p>
-    <w:bookmarkStart w:id="31" w:name="xuwu-zhao-jack"/>
-    <w:p>
-      <w:pPr>
-        <w:pStyle w:val="Heading3"/>
-      </w:pPr>
-      <w:r>
-        <w:t xml:space="preserve">Xuwu Zhao (Jack)</w:t>
-      </w:r>
-    </w:p>
-    <w:p>
-      <w:pPr>
-        <w:pStyle w:val="FirstParagraph"/>
-      </w:pPr>
-      <w:r>
-        <w:drawing>
-          <wp:inline>
-            <wp:extent cx="3810000" cy="3746500"/>
-            <wp:effectExtent b="0" l="0" r="0" t="0"/>
-            <wp:docPr descr="" title="" id="29" name="Picture"/>
-            <a:graphic>
-              <a:graphicData uri="http://schemas.openxmlformats.org/drawingml/2006/picture">
-                <pic:pic>
-                  <pic:nvPicPr>
-                    <pic:cNvPr descr="img/ge2021_jack_zhao.png" id="30" name="Picture"/>
-                    <pic:cNvPicPr>
-                      <a:picLocks noChangeArrowheads="1" noChangeAspect="1"/>
-                    </pic:cNvPicPr>
-                  </pic:nvPicPr>
-                  <pic:blipFill>
-                    <a:blip r:embed="rId28"/>
-                    <a:stretch>
-                      <a:fillRect/>
-                    </a:stretch>
-                  </pic:blipFill>
-                  <pic:spPr bwMode="auto">
-                    <a:xfrm>
-                      <a:off x="0" y="0"/>
-                      <a:ext cx="3810000" cy="3746500"/>
-                    </a:xfrm>
-                    <a:prstGeom prst="rect">
-                      <a:avLst/>
-                    </a:prstGeom>
-                    <a:noFill/>
-                    <a:ln w="9525">
-                      <a:noFill/>
-                      <a:headEnd/>
-                      <a:tailEnd/>
-                    </a:ln>
-                  </pic:spPr>
-                </pic:pic>
-              </a:graphicData>
-            </a:graphic>
-          </wp:inline>
-        </w:drawing>
-      </w:r>
-    </w:p>
-    <w:p>
-      <w:pPr>
-        <w:pStyle w:val="Compact"/>
-        <w:numPr>
-          <w:ilvl w:val="0"/>
-          <w:numId w:val="1005"/>
-        </w:numPr>
-      </w:pPr>
-      <w:r>
-        <w:t xml:space="preserve">1308347@wku.edu.cn</w:t>
-      </w:r>
-    </w:p>
-    <w:p>
-      <w:pPr>
-        <w:pStyle w:val="Compact"/>
-        <w:numPr>
-          <w:ilvl w:val="0"/>
-          <w:numId w:val="1005"/>
-        </w:numPr>
-      </w:pPr>
-      <w:r>
-        <w:t xml:space="preserve">Sophomore major in</w:t>
-      </w:r>
-      <w:r>
-        <w:t xml:space="preserve"> </w:t>
-      </w:r>
-      <w:r>
-        <w:rPr>
-          <w:i/>
-          <w:iCs/>
-        </w:rPr>
-        <w:t xml:space="preserve">Finance</w:t>
-      </w:r>
-    </w:p>
-    <w:p>
-      <w:pPr>
-        <w:pStyle w:val="Compact"/>
-        <w:numPr>
-          <w:ilvl w:val="0"/>
-          <w:numId w:val="1005"/>
-        </w:numPr>
-      </w:pPr>
-      <w:r>
-        <w:t xml:space="preserve">Awarded the Dean’s Scholarship-First Class</w:t>
-      </w:r>
-    </w:p>
-    <w:p>
-      <w:pPr>
-        <w:pStyle w:val="Compact"/>
-        <w:numPr>
-          <w:ilvl w:val="0"/>
-          <w:numId w:val="1005"/>
-        </w:numPr>
-      </w:pPr>
-      <w:r>
-        <w:t xml:space="preserve">Zhejiang Provincial Scholarship for the 2023-2024 academic year</w:t>
-      </w:r>
-    </w:p>
-    <w:p>
-      <w:pPr>
-        <w:pStyle w:val="Compact"/>
-        <w:numPr>
-          <w:ilvl w:val="0"/>
-          <w:numId w:val="1005"/>
-        </w:numPr>
-      </w:pPr>
-      <w:r>
-        <w:t xml:space="preserve">interests extend to Management Science and Accounting</w:t>
-      </w:r>
-    </w:p>
-    <w:p>
-      <w:r>
-        <w:pict>
-          <v:rect style="width:0;height:1.5pt" o:hralign="center" o:hrstd="t" o:hr="t"/>
-        </w:pict>
+        <w:t xml:space="preserve">Chapter 1: The Purpose of Research</w:t>
+      </w:r>
+    </w:p>
+    <w:p>
+      <w:pPr>
+        <w:pStyle w:val="Compact"/>
+        <w:numPr>
+          <w:ilvl w:val="0"/>
+          <w:numId w:val="1007"/>
+        </w:numPr>
+      </w:pPr>
+      <w:r>
+        <w:t xml:space="preserve">Describe the purpose of scientific research</w:t>
+      </w:r>
+    </w:p>
+    <w:p>
+      <w:pPr>
+        <w:pStyle w:val="Compact"/>
+        <w:numPr>
+          <w:ilvl w:val="0"/>
+          <w:numId w:val="1007"/>
+        </w:numPr>
+      </w:pPr>
+      <w:r>
+        <w:t xml:space="preserve">Describe two theories of knowledge: falsifiability and the scientific revolution</w:t>
+      </w:r>
+    </w:p>
+    <w:p>
+      <w:pPr>
+        <w:pStyle w:val="Compact"/>
+        <w:numPr>
+          <w:ilvl w:val="0"/>
+          <w:numId w:val="1007"/>
+        </w:numPr>
+      </w:pPr>
+      <w:r>
+        <w:t xml:space="preserve">Compare and contrast qualitative, quantitative, and mixed methods</w:t>
+      </w:r>
+    </w:p>
+    <w:p>
+      <w:pPr>
+        <w:pStyle w:val="Compact"/>
+        <w:numPr>
+          <w:ilvl w:val="0"/>
+          <w:numId w:val="1007"/>
+        </w:numPr>
+      </w:pPr>
+      <w:r>
+        <w:t xml:space="preserve">Explain the importance of ethics and objectivity in research</w:t>
+      </w:r>
+    </w:p>
+    <w:bookmarkEnd w:id="29"/>
+    <w:bookmarkStart w:id="30" w:name="X6f8f1f6ee276f95ca40b4acc35ca718b24183a0"/>
+    <w:p>
+      <w:pPr>
+        <w:pStyle w:val="Heading2"/>
+      </w:pPr>
+      <w:r>
+        <w:t xml:space="preserve">Chapter 2: Formulating a Research Question</w:t>
+      </w:r>
+    </w:p>
+    <w:p>
+      <w:pPr>
+        <w:pStyle w:val="Compact"/>
+        <w:numPr>
+          <w:ilvl w:val="0"/>
+          <w:numId w:val="1008"/>
+        </w:numPr>
+      </w:pPr>
+      <w:r>
+        <w:t xml:space="preserve">Choose a research topic.</w:t>
+      </w:r>
+    </w:p>
+    <w:p>
+      <w:pPr>
+        <w:pStyle w:val="Compact"/>
+        <w:numPr>
+          <w:ilvl w:val="0"/>
+          <w:numId w:val="1008"/>
+        </w:numPr>
+      </w:pPr>
+      <w:r>
+        <w:t xml:space="preserve">Explain how to operationalize research constructs</w:t>
+      </w:r>
+    </w:p>
+    <w:p>
+      <w:pPr>
+        <w:pStyle w:val="Compact"/>
+        <w:numPr>
+          <w:ilvl w:val="0"/>
+          <w:numId w:val="1008"/>
+        </w:numPr>
+      </w:pPr>
+      <w:r>
+        <w:t xml:space="preserve">Describe the different types of variables</w:t>
+      </w:r>
+    </w:p>
+    <w:p>
+      <w:pPr>
+        <w:pStyle w:val="Compact"/>
+        <w:numPr>
+          <w:ilvl w:val="0"/>
+          <w:numId w:val="1008"/>
+        </w:numPr>
+      </w:pPr>
+      <w:r>
+        <w:t xml:space="preserve">Formulate the various types of hypotheses</w:t>
+      </w:r>
+    </w:p>
+    <w:p>
+      <w:pPr>
+        <w:pStyle w:val="Compact"/>
+        <w:numPr>
+          <w:ilvl w:val="0"/>
+          <w:numId w:val="1008"/>
+        </w:numPr>
+      </w:pPr>
+      <w:r>
+        <w:t xml:space="preserve">Create a visualization of a research question</w:t>
+      </w:r>
+    </w:p>
+    <w:bookmarkEnd w:id="30"/>
+    <w:bookmarkStart w:id="31" w:name="Xef6c96ad579347aa4b58391eed761b7f8ea7a83"/>
+    <w:p>
+      <w:pPr>
+        <w:pStyle w:val="Heading2"/>
+      </w:pPr>
+      <w:r>
+        <w:t xml:space="preserve">Chapter 3: Researching and Writing the Literature Review</w:t>
+      </w:r>
+    </w:p>
+    <w:p>
+      <w:pPr>
+        <w:pStyle w:val="Compact"/>
+        <w:numPr>
+          <w:ilvl w:val="0"/>
+          <w:numId w:val="1009"/>
+        </w:numPr>
+      </w:pPr>
+      <w:r>
+        <w:t xml:space="preserve">Describe the purpose of a literature review</w:t>
+      </w:r>
+    </w:p>
+    <w:p>
+      <w:pPr>
+        <w:pStyle w:val="Compact"/>
+        <w:numPr>
+          <w:ilvl w:val="0"/>
+          <w:numId w:val="1009"/>
+        </w:numPr>
+      </w:pPr>
+      <w:r>
+        <w:t xml:space="preserve">Learn about online databases as resources</w:t>
+      </w:r>
+    </w:p>
+    <w:p>
+      <w:pPr>
+        <w:pStyle w:val="Compact"/>
+        <w:numPr>
+          <w:ilvl w:val="0"/>
+          <w:numId w:val="1009"/>
+        </w:numPr>
+      </w:pPr>
+      <w:r>
+        <w:t xml:space="preserve">Examine different ways of organizing a literature review</w:t>
+      </w:r>
+    </w:p>
+    <w:p>
+      <w:pPr>
+        <w:pStyle w:val="Compact"/>
+        <w:numPr>
+          <w:ilvl w:val="0"/>
+          <w:numId w:val="1009"/>
+        </w:numPr>
+      </w:pPr>
+      <w:r>
+        <w:t xml:space="preserve">Discuss how to think critically and analyze studies</w:t>
+      </w:r>
+    </w:p>
+    <w:p>
+      <w:pPr>
+        <w:pStyle w:val="Compact"/>
+        <w:numPr>
+          <w:ilvl w:val="0"/>
+          <w:numId w:val="1009"/>
+        </w:numPr>
+      </w:pPr>
+      <w:r>
+        <w:t xml:space="preserve">Identify the correct placement of study hypotheses</w:t>
+      </w:r>
+    </w:p>
+    <w:p>
+      <w:pPr>
+        <w:pStyle w:val="Compact"/>
+        <w:numPr>
+          <w:ilvl w:val="0"/>
+          <w:numId w:val="1009"/>
+        </w:numPr>
+      </w:pPr>
+      <w:r>
+        <w:t xml:space="preserve">Compare and contrast a systematic review of the literature and a literature review</w:t>
       </w:r>
     </w:p>
     <w:bookmarkEnd w:id="31"/>
-    <w:bookmarkStart w:id="35" w:name="xiao-zhi-eloise"/>
-    <w:p>
-      <w:pPr>
-        <w:pStyle w:val="Heading3"/>
-      </w:pPr>
-      <w:r>
-        <w:t xml:space="preserve">Xiao Zhi (Eloise)</w:t>
-      </w:r>
-    </w:p>
-    <w:p>
-      <w:pPr>
-        <w:pStyle w:val="FirstParagraph"/>
-      </w:pPr>
-      <w:r>
-        <w:drawing>
-          <wp:inline>
-            <wp:extent cx="4978400" cy="5080000"/>
-            <wp:effectExtent b="0" l="0" r="0" t="0"/>
-            <wp:docPr descr="" title="" id="33" name="Picture"/>
-            <a:graphic>
-              <a:graphicData uri="http://schemas.openxmlformats.org/drawingml/2006/picture">
-                <pic:pic>
-                  <pic:nvPicPr>
-                    <pic:cNvPr descr="img/ge2021_eloise_zhi.png" id="34" name="Picture"/>
-                    <pic:cNvPicPr>
-                      <a:picLocks noChangeArrowheads="1" noChangeAspect="1"/>
-                    </pic:cNvPicPr>
-                  </pic:nvPicPr>
-                  <pic:blipFill>
-                    <a:blip r:embed="rId32"/>
-                    <a:stretch>
-                      <a:fillRect/>
-                    </a:stretch>
-                  </pic:blipFill>
-                  <pic:spPr bwMode="auto">
-                    <a:xfrm>
-                      <a:off x="0" y="0"/>
-                      <a:ext cx="4978400" cy="5080000"/>
-                    </a:xfrm>
-                    <a:prstGeom prst="rect">
-                      <a:avLst/>
-                    </a:prstGeom>
-                    <a:noFill/>
-                    <a:ln w="9525">
-                      <a:noFill/>
-                      <a:headEnd/>
-                      <a:tailEnd/>
-                    </a:ln>
-                  </pic:spPr>
-                </pic:pic>
-              </a:graphicData>
-            </a:graphic>
-          </wp:inline>
-        </w:drawing>
-      </w:r>
-    </w:p>
-    <w:p>
-      <w:pPr>
-        <w:pStyle w:val="Compact"/>
-        <w:numPr>
-          <w:ilvl w:val="0"/>
-          <w:numId w:val="1006"/>
-        </w:numPr>
-      </w:pPr>
-      <w:r>
-        <w:t xml:space="preserve">1306209@wku.edu.cn</w:t>
-      </w:r>
-    </w:p>
-    <w:p>
-      <w:pPr>
-        <w:pStyle w:val="Compact"/>
-        <w:numPr>
-          <w:ilvl w:val="0"/>
-          <w:numId w:val="1006"/>
-        </w:numPr>
-      </w:pPr>
-      <w:r>
-        <w:t xml:space="preserve">Sophomore major in</w:t>
-      </w:r>
-      <w:r>
-        <w:t xml:space="preserve"> </w:t>
-      </w:r>
-      <w:r>
-        <w:rPr>
-          <w:i/>
-          <w:iCs/>
-        </w:rPr>
-        <w:t xml:space="preserve">Economics</w:t>
-      </w:r>
-    </w:p>
-    <w:p>
-      <w:pPr>
-        <w:pStyle w:val="Compact"/>
-        <w:numPr>
-          <w:ilvl w:val="0"/>
-          <w:numId w:val="1006"/>
-        </w:numPr>
-      </w:pPr>
-      <w:r>
-        <w:t xml:space="preserve">From Hangzhou, Zhejiang</w:t>
-      </w:r>
-    </w:p>
-    <w:p>
-      <w:pPr>
-        <w:pStyle w:val="Compact"/>
-        <w:numPr>
-          <w:ilvl w:val="0"/>
-          <w:numId w:val="1006"/>
-        </w:numPr>
-      </w:pPr>
-      <w:r>
-        <w:t xml:space="preserve">Active member of the Student Advisory Council</w:t>
-      </w:r>
-    </w:p>
-    <w:p>
-      <w:r>
-        <w:pict>
-          <v:rect style="width:0;height:1.5pt" o:hralign="center" o:hrstd="t" o:hr="t"/>
-        </w:pict>
+    <w:bookmarkStart w:id="32" w:name="chapter-4-quantitative-designs"/>
+    <w:p>
+      <w:pPr>
+        <w:pStyle w:val="Heading2"/>
+      </w:pPr>
+      <w:r>
+        <w:t xml:space="preserve">Chapter 4: Quantitative Designs</w:t>
+      </w:r>
+    </w:p>
+    <w:p>
+      <w:pPr>
+        <w:pStyle w:val="Compact"/>
+        <w:numPr>
+          <w:ilvl w:val="0"/>
+          <w:numId w:val="1010"/>
+        </w:numPr>
+      </w:pPr>
+      <w:r>
+        <w:t xml:space="preserve">Describe the purpose of exploratory, descriptive, and explanatory studies.</w:t>
+      </w:r>
+    </w:p>
+    <w:p>
+      <w:pPr>
+        <w:pStyle w:val="Compact"/>
+        <w:numPr>
+          <w:ilvl w:val="0"/>
+          <w:numId w:val="1010"/>
+        </w:numPr>
+      </w:pPr>
+      <w:r>
+        <w:t xml:space="preserve">Compare and contrast cross-sectional and longitudinal studies.</w:t>
+      </w:r>
+    </w:p>
+    <w:p>
+      <w:pPr>
+        <w:pStyle w:val="Compact"/>
+        <w:numPr>
+          <w:ilvl w:val="0"/>
+          <w:numId w:val="1010"/>
+        </w:numPr>
+      </w:pPr>
+      <w:r>
+        <w:t xml:space="preserve">Explain the differences between nomothetic research and idiographic research.</w:t>
+      </w:r>
+    </w:p>
+    <w:p>
+      <w:pPr>
+        <w:pStyle w:val="Compact"/>
+        <w:numPr>
+          <w:ilvl w:val="0"/>
+          <w:numId w:val="1010"/>
+        </w:numPr>
+      </w:pPr>
+      <w:r>
+        <w:t xml:space="preserve">Discuss each type of experimental design and its advantages and disadvantages.</w:t>
+      </w:r>
+    </w:p>
+    <w:bookmarkEnd w:id="32"/>
+    <w:bookmarkStart w:id="33" w:name="X090f2c56f796154834dedd0d649791516b3b96a"/>
+    <w:p>
+      <w:pPr>
+        <w:pStyle w:val="Heading2"/>
+      </w:pPr>
+      <w:r>
+        <w:t xml:space="preserve">Chapter 5: Measurement Errors, Reliability, Validity</w:t>
+      </w:r>
+    </w:p>
+    <w:p>
+      <w:pPr>
+        <w:pStyle w:val="Compact"/>
+        <w:numPr>
+          <w:ilvl w:val="0"/>
+          <w:numId w:val="1011"/>
+        </w:numPr>
+      </w:pPr>
+      <w:r>
+        <w:t xml:space="preserve">Recognize measurement errors and describe how to categorize them.</w:t>
+      </w:r>
+    </w:p>
+    <w:p>
+      <w:pPr>
+        <w:pStyle w:val="Compact"/>
+        <w:numPr>
+          <w:ilvl w:val="0"/>
+          <w:numId w:val="1011"/>
+        </w:numPr>
+      </w:pPr>
+      <w:r>
+        <w:t xml:space="preserve">Compare and contrast the interrater reliability, test-retest reliability, and internal consistency reliability.</w:t>
+      </w:r>
+    </w:p>
+    <w:p>
+      <w:pPr>
+        <w:pStyle w:val="Compact"/>
+        <w:numPr>
+          <w:ilvl w:val="0"/>
+          <w:numId w:val="1011"/>
+        </w:numPr>
+      </w:pPr>
+      <w:r>
+        <w:t xml:space="preserve">Analyze the different types of validity: face validity, content validity, construct validity, criterion validity, concurrent validity, and predictive validity.</w:t>
+      </w:r>
+    </w:p>
+    <w:bookmarkEnd w:id="33"/>
+    <w:bookmarkStart w:id="34" w:name="chapter-6-sampling"/>
+    <w:p>
+      <w:pPr>
+        <w:pStyle w:val="Heading2"/>
+      </w:pPr>
+      <w:r>
+        <w:t xml:space="preserve">Chapter 6: Sampling</w:t>
+      </w:r>
+    </w:p>
+    <w:p>
+      <w:pPr>
+        <w:pStyle w:val="Compact"/>
+        <w:numPr>
+          <w:ilvl w:val="0"/>
+          <w:numId w:val="1012"/>
+        </w:numPr>
+      </w:pPr>
+      <w:r>
+        <w:t xml:space="preserve">Explain the purpose of sampling.</w:t>
+      </w:r>
+    </w:p>
+    <w:p>
+      <w:pPr>
+        <w:pStyle w:val="Compact"/>
+        <w:numPr>
+          <w:ilvl w:val="0"/>
+          <w:numId w:val="1012"/>
+        </w:numPr>
+      </w:pPr>
+      <w:r>
+        <w:t xml:space="preserve">Compare and contrast probability and nonprobability sampling.</w:t>
+      </w:r>
+    </w:p>
+    <w:p>
+      <w:pPr>
+        <w:pStyle w:val="Compact"/>
+        <w:numPr>
+          <w:ilvl w:val="0"/>
+          <w:numId w:val="1012"/>
+        </w:numPr>
+      </w:pPr>
+      <w:r>
+        <w:t xml:space="preserve">Describe the types of nonprobability sampling.</w:t>
+      </w:r>
+    </w:p>
+    <w:p>
+      <w:pPr>
+        <w:pStyle w:val="Compact"/>
+        <w:numPr>
+          <w:ilvl w:val="0"/>
+          <w:numId w:val="1012"/>
+        </w:numPr>
+      </w:pPr>
+      <w:r>
+        <w:t xml:space="preserve">Summarize the types of probability sampling.</w:t>
+      </w:r>
+    </w:p>
+    <w:p>
+      <w:pPr>
+        <w:pStyle w:val="Compact"/>
+        <w:numPr>
+          <w:ilvl w:val="0"/>
+          <w:numId w:val="1012"/>
+        </w:numPr>
+      </w:pPr>
+      <w:r>
+        <w:t xml:space="preserve">Understand sampling error, confidence interval, and saturation.</w:t>
+      </w:r>
+    </w:p>
+    <w:bookmarkEnd w:id="34"/>
+    <w:bookmarkStart w:id="35" w:name="Xc61594af4cdf33d6d90e840b66a879bef79762a"/>
+    <w:p>
+      <w:pPr>
+        <w:pStyle w:val="Heading2"/>
+      </w:pPr>
+      <w:r>
+        <w:t xml:space="preserve">Chapter 7: Data Collection for Quantitative Research</w:t>
+      </w:r>
+    </w:p>
+    <w:p>
+      <w:pPr>
+        <w:pStyle w:val="Compact"/>
+        <w:numPr>
+          <w:ilvl w:val="0"/>
+          <w:numId w:val="1013"/>
+        </w:numPr>
+      </w:pPr>
+      <w:r>
+        <w:t xml:space="preserve">Familiarize yourself with the details of experimental design.</w:t>
+      </w:r>
+    </w:p>
+    <w:p>
+      <w:pPr>
+        <w:pStyle w:val="Compact"/>
+        <w:numPr>
+          <w:ilvl w:val="0"/>
+          <w:numId w:val="1013"/>
+        </w:numPr>
+      </w:pPr>
+      <w:r>
+        <w:t xml:space="preserve">Familiarize yourself with the details of quasi-experimental design.</w:t>
+      </w:r>
+    </w:p>
+    <w:p>
+      <w:pPr>
+        <w:pStyle w:val="Compact"/>
+        <w:numPr>
+          <w:ilvl w:val="0"/>
+          <w:numId w:val="1013"/>
+        </w:numPr>
+      </w:pPr>
+      <w:r>
+        <w:t xml:space="preserve">Understand the steps of designing a survey study.</w:t>
+      </w:r>
+    </w:p>
+    <w:p>
+      <w:pPr>
+        <w:pStyle w:val="Compact"/>
+        <w:numPr>
+          <w:ilvl w:val="0"/>
+          <w:numId w:val="1013"/>
+        </w:numPr>
+      </w:pPr>
+      <w:r>
+        <w:t xml:space="preserve">Consider additional data collection sources.</w:t>
       </w:r>
     </w:p>
     <w:bookmarkEnd w:id="35"/>
-    <w:bookmarkStart w:id="39" w:name="yutong-liu-sigmund"/>
-    <w:p>
-      <w:pPr>
-        <w:pStyle w:val="Heading3"/>
-      </w:pPr>
-      <w:r>
-        <w:t xml:space="preserve">Yutong Liu (Sigmund)</w:t>
-      </w:r>
-    </w:p>
-    <w:p>
-      <w:pPr>
-        <w:pStyle w:val="FirstParagraph"/>
-      </w:pPr>
-      <w:r>
-        <w:drawing>
-          <wp:inline>
-            <wp:extent cx="5016500" cy="5041900"/>
-            <wp:effectExtent b="0" l="0" r="0" t="0"/>
-            <wp:docPr descr="" title="" id="37" name="Picture"/>
-            <a:graphic>
-              <a:graphicData uri="http://schemas.openxmlformats.org/drawingml/2006/picture">
-                <pic:pic>
-                  <pic:nvPicPr>
-                    <pic:cNvPr descr="img/ge2021_ge2021_sigmund_liu.png" id="38" name="Picture"/>
-                    <pic:cNvPicPr>
-                      <a:picLocks noChangeArrowheads="1" noChangeAspect="1"/>
-                    </pic:cNvPicPr>
-                  </pic:nvPicPr>
-                  <pic:blipFill>
-                    <a:blip r:embed="rId36"/>
-                    <a:stretch>
-                      <a:fillRect/>
-                    </a:stretch>
-                  </pic:blipFill>
-                  <pic:spPr bwMode="auto">
-                    <a:xfrm>
-                      <a:off x="0" y="0"/>
-                      <a:ext cx="5016500" cy="5041900"/>
-                    </a:xfrm>
-                    <a:prstGeom prst="rect">
-                      <a:avLst/>
-                    </a:prstGeom>
-                    <a:noFill/>
-                    <a:ln w="9525">
-                      <a:noFill/>
-                      <a:headEnd/>
-                      <a:tailEnd/>
-                    </a:ln>
-                  </pic:spPr>
-                </pic:pic>
-              </a:graphicData>
-            </a:graphic>
-          </wp:inline>
-        </w:drawing>
-      </w:r>
-    </w:p>
-    <w:p>
-      <w:pPr>
-        <w:pStyle w:val="Compact"/>
-        <w:numPr>
-          <w:ilvl w:val="0"/>
-          <w:numId w:val="1007"/>
-        </w:numPr>
-      </w:pPr>
-      <w:r>
-        <w:t xml:space="preserve">1308198@wku.edu.cn</w:t>
-      </w:r>
-    </w:p>
-    <w:p>
-      <w:pPr>
-        <w:pStyle w:val="Compact"/>
-        <w:numPr>
-          <w:ilvl w:val="0"/>
-          <w:numId w:val="1007"/>
-        </w:numPr>
-      </w:pPr>
-      <w:r>
-        <w:t xml:space="preserve">Sophomore major in</w:t>
-      </w:r>
-      <w:r>
-        <w:t xml:space="preserve"> </w:t>
-      </w:r>
-      <w:r>
-        <w:rPr>
-          <w:i/>
-          <w:iCs/>
-        </w:rPr>
-        <w:t xml:space="preserve">Accounting</w:t>
-      </w:r>
-    </w:p>
-    <w:p>
-      <w:pPr>
-        <w:pStyle w:val="Compact"/>
-        <w:numPr>
-          <w:ilvl w:val="0"/>
-          <w:numId w:val="1007"/>
-        </w:numPr>
-      </w:pPr>
-      <w:r>
-        <w:t xml:space="preserve">Enjoying learning new and challenging topics</w:t>
+    <w:bookmarkStart w:id="36" w:name="chapter-8-secondary-data"/>
+    <w:p>
+      <w:pPr>
+        <w:pStyle w:val="Heading2"/>
+      </w:pPr>
+      <w:r>
+        <w:t xml:space="preserve">Chapter 8: Secondary Data</w:t>
+      </w:r>
+    </w:p>
+    <w:p>
+      <w:pPr>
+        <w:pStyle w:val="Compact"/>
+        <w:numPr>
+          <w:ilvl w:val="0"/>
+          <w:numId w:val="1014"/>
+        </w:numPr>
+      </w:pPr>
+      <w:r>
+        <w:t xml:space="preserve">Describe the benefits of using secondary data.</w:t>
+      </w:r>
+    </w:p>
+    <w:p>
+      <w:pPr>
+        <w:pStyle w:val="Compact"/>
+        <w:numPr>
+          <w:ilvl w:val="0"/>
+          <w:numId w:val="1014"/>
+        </w:numPr>
+      </w:pPr>
+      <w:r>
+        <w:t xml:space="preserve">Identify the major sources of secondary data.</w:t>
+      </w:r>
+    </w:p>
+    <w:p>
+      <w:pPr>
+        <w:pStyle w:val="Compact"/>
+        <w:numPr>
+          <w:ilvl w:val="0"/>
+          <w:numId w:val="1014"/>
+        </w:numPr>
+      </w:pPr>
+      <w:r>
+        <w:t xml:space="preserve">Explain the drawbacks of using secondary data.</w:t>
+      </w:r>
+    </w:p>
+    <w:bookmarkEnd w:id="36"/>
+    <w:bookmarkStart w:id="37" w:name="X1c9fd225da848838346088731e2d97a61c3fe15"/>
+    <w:p>
+      <w:pPr>
+        <w:pStyle w:val="Heading2"/>
+      </w:pPr>
+      <w:r>
+        <w:t xml:space="preserve">Chapter 9: Entering and Organizing Quantitative Data</w:t>
+      </w:r>
+    </w:p>
+    <w:p>
+      <w:pPr>
+        <w:pStyle w:val="Compact"/>
+        <w:numPr>
+          <w:ilvl w:val="0"/>
+          <w:numId w:val="1015"/>
+        </w:numPr>
+      </w:pPr>
+      <w:r>
+        <w:t xml:space="preserve">Explain the purpose of entering and organizing data logically.</w:t>
+      </w:r>
+    </w:p>
+    <w:p>
+      <w:pPr>
+        <w:pStyle w:val="Compact"/>
+        <w:numPr>
+          <w:ilvl w:val="0"/>
+          <w:numId w:val="1015"/>
+        </w:numPr>
+      </w:pPr>
+      <w:r>
+        <w:t xml:space="preserve">Summarize the steps needed to prepare to enter data.</w:t>
+      </w:r>
+    </w:p>
+    <w:p>
+      <w:pPr>
+        <w:pStyle w:val="Compact"/>
+        <w:numPr>
+          <w:ilvl w:val="0"/>
+          <w:numId w:val="1015"/>
+        </w:numPr>
+      </w:pPr>
+      <w:r>
+        <w:t xml:space="preserve">Describe how to organize and input variables and their information.</w:t>
+      </w:r>
+    </w:p>
+    <w:bookmarkEnd w:id="37"/>
+    <w:bookmarkStart w:id="38" w:name="chapter-10-analyzing-quantitative-data"/>
+    <w:p>
+      <w:pPr>
+        <w:pStyle w:val="Heading2"/>
+      </w:pPr>
+      <w:r>
+        <w:t xml:space="preserve">Chapter 10: Analyzing Quantitative Data</w:t>
+      </w:r>
+    </w:p>
+    <w:p>
+      <w:pPr>
+        <w:pStyle w:val="Compact"/>
+        <w:numPr>
+          <w:ilvl w:val="0"/>
+          <w:numId w:val="1016"/>
+        </w:numPr>
+      </w:pPr>
+      <w:r>
+        <w:t xml:space="preserve">Summarize why statistics are used in research methods</w:t>
+      </w:r>
+    </w:p>
+    <w:p>
+      <w:pPr>
+        <w:pStyle w:val="Compact"/>
+        <w:numPr>
+          <w:ilvl w:val="0"/>
+          <w:numId w:val="1016"/>
+        </w:numPr>
+      </w:pPr>
+      <w:r>
+        <w:t xml:space="preserve">Conduct univariate analysis</w:t>
+      </w:r>
+    </w:p>
+    <w:p>
+      <w:pPr>
+        <w:pStyle w:val="Compact"/>
+        <w:numPr>
+          <w:ilvl w:val="0"/>
+          <w:numId w:val="1016"/>
+        </w:numPr>
+      </w:pPr>
+      <w:r>
+        <w:t xml:space="preserve">Explain the measures of central tendency</w:t>
+      </w:r>
+    </w:p>
+    <w:p>
+      <w:pPr>
+        <w:pStyle w:val="Compact"/>
+        <w:numPr>
+          <w:ilvl w:val="0"/>
+          <w:numId w:val="1016"/>
+        </w:numPr>
+      </w:pPr>
+      <w:r>
+        <w:t xml:space="preserve">Define measures of variability and dispersion</w:t>
+      </w:r>
+    </w:p>
+    <w:p>
+      <w:pPr>
+        <w:pStyle w:val="Compact"/>
+        <w:numPr>
+          <w:ilvl w:val="0"/>
+          <w:numId w:val="1016"/>
+        </w:numPr>
+      </w:pPr>
+      <w:r>
+        <w:t xml:space="preserve">Describe the various ways to graphically represent data</w:t>
+      </w:r>
+    </w:p>
+    <w:p>
+      <w:pPr>
+        <w:pStyle w:val="Compact"/>
+        <w:numPr>
+          <w:ilvl w:val="0"/>
+          <w:numId w:val="1016"/>
+        </w:numPr>
+      </w:pPr>
+      <w:r>
+        <w:t xml:space="preserve">Conduct bivariate analysis</w:t>
+      </w:r>
+    </w:p>
+    <w:bookmarkEnd w:id="38"/>
+    <w:bookmarkStart w:id="39" w:name="X97a87459aed2a575cef74a1ab02a10216e96f17"/>
+    <w:p>
+      <w:pPr>
+        <w:pStyle w:val="Heading2"/>
+      </w:pPr>
+      <w:r>
+        <w:t xml:space="preserve">Chapter 11: Qualitative Designs And Data Collection</w:t>
+      </w:r>
+    </w:p>
+    <w:p>
+      <w:pPr>
+        <w:pStyle w:val="Compact"/>
+        <w:numPr>
+          <w:ilvl w:val="0"/>
+          <w:numId w:val="1017"/>
+        </w:numPr>
+      </w:pPr>
+      <w:r>
+        <w:t xml:space="preserve">Plan a qualitative study in a community that is not well known or understood.</w:t>
+      </w:r>
+    </w:p>
+    <w:p>
+      <w:pPr>
+        <w:pStyle w:val="Compact"/>
+        <w:numPr>
+          <w:ilvl w:val="0"/>
+          <w:numId w:val="1017"/>
+        </w:numPr>
+      </w:pPr>
+      <w:r>
+        <w:t xml:space="preserve">Understand that qualitative research and quantitative research are not opposed.</w:t>
+      </w:r>
+    </w:p>
+    <w:p>
+      <w:pPr>
+        <w:pStyle w:val="Compact"/>
+        <w:numPr>
+          <w:ilvl w:val="0"/>
+          <w:numId w:val="1017"/>
+        </w:numPr>
+      </w:pPr>
+      <w:r>
+        <w:t xml:space="preserve">Do participant observation, write field notes, and manage them in a database.</w:t>
+      </w:r>
+    </w:p>
+    <w:p>
+      <w:pPr>
+        <w:pStyle w:val="Compact"/>
+        <w:numPr>
+          <w:ilvl w:val="0"/>
+          <w:numId w:val="1017"/>
+        </w:numPr>
+      </w:pPr>
+      <w:r>
+        <w:t xml:space="preserve">Collect other data, like artifacts, photos, and videos; texts can also be collected.</w:t>
       </w:r>
     </w:p>
     <w:bookmarkEnd w:id="39"/>
+    <w:bookmarkStart w:id="40" w:name="X10d37152ece273ca1aa8051e73b79ec488abac2"/>
+    <w:p>
+      <w:pPr>
+        <w:pStyle w:val="Heading2"/>
+      </w:pPr>
+      <w:r>
+        <w:t xml:space="preserve">Chapter 12: Entering, Coding, and Analyzing Qualitative Data</w:t>
+      </w:r>
+    </w:p>
+    <w:p>
+      <w:pPr>
+        <w:pStyle w:val="Compact"/>
+        <w:numPr>
+          <w:ilvl w:val="0"/>
+          <w:numId w:val="1018"/>
+        </w:numPr>
+      </w:pPr>
+      <w:r>
+        <w:t xml:space="preserve">Describe how to enter, clean, and organize qualitative data.</w:t>
+      </w:r>
+    </w:p>
+    <w:p>
+      <w:pPr>
+        <w:pStyle w:val="Compact"/>
+        <w:numPr>
+          <w:ilvl w:val="0"/>
+          <w:numId w:val="1018"/>
+        </w:numPr>
+      </w:pPr>
+      <w:r>
+        <w:t xml:space="preserve">Examine and code raw data.</w:t>
+      </w:r>
+    </w:p>
+    <w:p>
+      <w:pPr>
+        <w:pStyle w:val="Compact"/>
+        <w:numPr>
+          <w:ilvl w:val="0"/>
+          <w:numId w:val="1018"/>
+        </w:numPr>
+      </w:pPr>
+      <w:r>
+        <w:t xml:space="preserve">Analyze qualitative data.</w:t>
+      </w:r>
+    </w:p>
     <w:bookmarkEnd w:id="40"/>
+    <w:bookmarkStart w:id="41" w:name="chapter-13-results-and-discussion"/>
+    <w:p>
+      <w:pPr>
+        <w:pStyle w:val="Heading2"/>
+      </w:pPr>
+      <w:r>
+        <w:t xml:space="preserve">Chapter 13: Results and Discussion</w:t>
+      </w:r>
+    </w:p>
+    <w:p>
+      <w:pPr>
+        <w:pStyle w:val="Compact"/>
+        <w:numPr>
+          <w:ilvl w:val="0"/>
+          <w:numId w:val="1019"/>
+        </w:numPr>
+      </w:pPr>
+      <w:r>
+        <w:t xml:space="preserve">Write a results section.</w:t>
+      </w:r>
+    </w:p>
+    <w:p>
+      <w:pPr>
+        <w:pStyle w:val="Compact"/>
+        <w:numPr>
+          <w:ilvl w:val="0"/>
+          <w:numId w:val="1019"/>
+        </w:numPr>
+      </w:pPr>
+      <w:r>
+        <w:t xml:space="preserve">Describe how to present results in quantitative studies.</w:t>
+      </w:r>
+    </w:p>
+    <w:p>
+      <w:pPr>
+        <w:pStyle w:val="Compact"/>
+        <w:numPr>
+          <w:ilvl w:val="0"/>
+          <w:numId w:val="1019"/>
+        </w:numPr>
+      </w:pPr>
+      <w:r>
+        <w:t xml:space="preserve">Explain how to present results in qualitative studies.</w:t>
+      </w:r>
+    </w:p>
+    <w:p>
+      <w:pPr>
+        <w:pStyle w:val="Compact"/>
+        <w:numPr>
+          <w:ilvl w:val="0"/>
+          <w:numId w:val="1019"/>
+        </w:numPr>
+      </w:pPr>
+      <w:r>
+        <w:t xml:space="preserve">Prepare visual representations of results.</w:t>
+      </w:r>
+    </w:p>
+    <w:p>
+      <w:pPr>
+        <w:pStyle w:val="Compact"/>
+        <w:numPr>
+          <w:ilvl w:val="0"/>
+          <w:numId w:val="1019"/>
+        </w:numPr>
+      </w:pPr>
+      <w:r>
+        <w:t xml:space="preserve">Compose a discussion section.</w:t>
+      </w:r>
+    </w:p>
+    <w:p>
+      <w:pPr>
+        <w:pStyle w:val="Compact"/>
+        <w:numPr>
+          <w:ilvl w:val="0"/>
+          <w:numId w:val="1019"/>
+        </w:numPr>
+      </w:pPr>
+      <w:r>
+        <w:t xml:space="preserve">Develop a recommendations section based on methodology or topic.</w:t>
+      </w:r>
+    </w:p>
     <w:bookmarkEnd w:id="41"/>
-    <w:bookmarkStart w:id="56" w:name="course-introduction"/>
+    <w:bookmarkStart w:id="42" w:name="chapter-14-presenting-your-research"/>
+    <w:p>
+      <w:pPr>
+        <w:pStyle w:val="Heading2"/>
+      </w:pPr>
+      <w:r>
+        <w:t xml:space="preserve">Chapter 14: Presenting Your Research</w:t>
+      </w:r>
+    </w:p>
+    <w:p>
+      <w:pPr>
+        <w:pStyle w:val="Compact"/>
+        <w:numPr>
+          <w:ilvl w:val="0"/>
+          <w:numId w:val="1020"/>
+        </w:numPr>
+      </w:pPr>
+      <w:r>
+        <w:t xml:space="preserve">Explain how best to present your study to an audience.</w:t>
+      </w:r>
+    </w:p>
+    <w:p>
+      <w:pPr>
+        <w:pStyle w:val="Compact"/>
+        <w:numPr>
+          <w:ilvl w:val="0"/>
+          <w:numId w:val="1020"/>
+        </w:numPr>
+      </w:pPr>
+      <w:r>
+        <w:t xml:space="preserve">Discuss how to apply to regional and national conferences.</w:t>
+      </w:r>
+    </w:p>
+    <w:p>
+      <w:pPr>
+        <w:pStyle w:val="Compact"/>
+        <w:numPr>
+          <w:ilvl w:val="0"/>
+          <w:numId w:val="1020"/>
+        </w:numPr>
+      </w:pPr>
+      <w:r>
+        <w:t xml:space="preserve">Describe how to get an article published in a peer-reviewed journal.</w:t>
+      </w:r>
+    </w:p>
+    <w:bookmarkEnd w:id="42"/>
+    <w:bookmarkEnd w:id="43"/>
+    <w:bookmarkStart w:id="45" w:name="course-information-and-syllabus"/>
     <w:p>
       <w:pPr>
         <w:pStyle w:val="Heading1"/>
       </w:pPr>
       <w:r>
-        <w:t xml:space="preserve">Course Introduction</w:t>
-      </w:r>
-    </w:p>
-    <w:p>
-      <w:pPr>
-        <w:pStyle w:val="Compact"/>
-        <w:numPr>
-          <w:ilvl w:val="0"/>
-          <w:numId w:val="1008"/>
-        </w:numPr>
-      </w:pPr>
-      <w:r>
-        <w:t xml:space="preserve">GE*2021 RESEARCH AND TECHNOLOGY (3 Credits)</w:t>
-      </w:r>
-    </w:p>
-    <w:p>
-      <w:pPr>
-        <w:pStyle w:val="Compact"/>
-        <w:numPr>
-          <w:ilvl w:val="1"/>
-          <w:numId w:val="1009"/>
-        </w:numPr>
-      </w:pPr>
-      <w:r>
-        <w:t xml:space="preserve">Introduction to the research process for students with majors in the College of Business and Public Management. Preparation of a formal research paper. Emphasizes the use of library resources and interdisciplinary approaches to designing, investigating, and reporting research activities. Writing Intensive.</w:t>
-      </w:r>
-    </w:p>
-    <w:bookmarkStart w:id="42" w:name="chapter-1-the-purpose-of-research"/>
+        <w:t xml:space="preserve">Course Information and Syllabus</w:t>
+      </w:r>
+    </w:p>
+    <w:bookmarkStart w:id="44" w:name="class-information"/>
     <w:p>
       <w:pPr>
         <w:pStyle w:val="Heading2"/>
       </w:pPr>
       <w:r>
-        <w:t xml:space="preserve">Chapter 1: The Purpose of Research</w:t>
-      </w:r>
-    </w:p>
-    <w:p>
-      <w:pPr>
-        <w:pStyle w:val="Compact"/>
-        <w:numPr>
-          <w:ilvl w:val="0"/>
-          <w:numId w:val="1010"/>
-        </w:numPr>
-      </w:pPr>
-      <w:r>
-        <w:t xml:space="preserve">Describe the purpose of scientific research</w:t>
-      </w:r>
-    </w:p>
-    <w:p>
-      <w:pPr>
-        <w:pStyle w:val="Compact"/>
-        <w:numPr>
-          <w:ilvl w:val="0"/>
-          <w:numId w:val="1010"/>
-        </w:numPr>
-      </w:pPr>
-      <w:r>
-        <w:t xml:space="preserve">Describe two theories of knowledge: falsifiability and the scientific revolution</w:t>
-      </w:r>
-    </w:p>
-    <w:p>
-      <w:pPr>
-        <w:pStyle w:val="Compact"/>
-        <w:numPr>
-          <w:ilvl w:val="0"/>
-          <w:numId w:val="1010"/>
-        </w:numPr>
-      </w:pPr>
-      <w:r>
-        <w:t xml:space="preserve">Compare and contrast qualitative, quantitative, and mixed methods</w:t>
-      </w:r>
-    </w:p>
-    <w:p>
-      <w:pPr>
-        <w:pStyle w:val="Compact"/>
-        <w:numPr>
-          <w:ilvl w:val="0"/>
-          <w:numId w:val="1010"/>
-        </w:numPr>
-      </w:pPr>
-      <w:r>
-        <w:t xml:space="preserve">Explain the importance of ethics and objectivity in research</w:t>
-      </w:r>
-    </w:p>
-    <w:bookmarkEnd w:id="42"/>
-    <w:bookmarkStart w:id="43" w:name="X6f8f1f6ee276f95ca40b4acc35ca718b24183a0"/>
+        <w:t xml:space="preserve">Class Information</w:t>
+      </w:r>
+    </w:p>
+    <w:p>
+      <w:pPr>
+        <w:pStyle w:val="Compact"/>
+        <w:numPr>
+          <w:ilvl w:val="0"/>
+          <w:numId w:val="1021"/>
+        </w:numPr>
+      </w:pPr>
+      <w:r>
+        <w:t xml:space="preserve">GE 2021 W01, W02, W03, W04: Research and Technology</w:t>
+      </w:r>
+    </w:p>
+    <w:p>
+      <w:pPr>
+        <w:pStyle w:val="Compact"/>
+        <w:numPr>
+          <w:ilvl w:val="0"/>
+          <w:numId w:val="1021"/>
+        </w:numPr>
+      </w:pPr>
+      <w:r>
+        <w:t xml:space="preserve">Class time: W01 W/F 1:00-2:15 · W02 W/F 2:30-3:45 · W03 W/F 5:30-6:45 · W04 W/F 7:00-8:15</w:t>
+      </w:r>
+    </w:p>
+    <w:p>
+      <w:pPr>
+        <w:pStyle w:val="Compact"/>
+        <w:numPr>
+          <w:ilvl w:val="0"/>
+          <w:numId w:val="1021"/>
+        </w:numPr>
+      </w:pPr>
+      <w:r>
+        <w:t xml:space="preserve">Class room: W01 A101 · W02 A301 · W03 A201 · W04 A201</w:t>
+      </w:r>
+    </w:p>
+    <w:p>
+      <w:pPr>
+        <w:pStyle w:val="Compact"/>
+        <w:numPr>
+          <w:ilvl w:val="0"/>
+          <w:numId w:val="1021"/>
+        </w:numPr>
+      </w:pPr>
+      <w:r>
+        <w:t xml:space="preserve">Office: CBPM B223 | Office hours: M/F 4:00-5:30 · W 6:00-8:00</w:t>
+      </w:r>
+    </w:p>
+    <w:bookmarkEnd w:id="44"/>
+    <w:bookmarkEnd w:id="45"/>
+    <w:bookmarkStart w:id="52" w:name="house-rule"/>
+    <w:p>
+      <w:pPr>
+        <w:pStyle w:val="Heading1"/>
+      </w:pPr>
+      <w:r>
+        <w:t xml:space="preserve">House Rule</w:t>
+      </w:r>
+    </w:p>
+    <w:p>
+      <w:pPr>
+        <w:pStyle w:val="Compact"/>
+        <w:numPr>
+          <w:ilvl w:val="0"/>
+          <w:numId w:val="1022"/>
+        </w:numPr>
+      </w:pPr>
+      <w:r>
+        <w:t xml:space="preserve">In class</w:t>
+      </w:r>
+    </w:p>
+    <w:p>
+      <w:pPr>
+        <w:pStyle w:val="Compact"/>
+        <w:numPr>
+          <w:ilvl w:val="0"/>
+          <w:numId w:val="1022"/>
+        </w:numPr>
+      </w:pPr>
+      <w:r>
+        <w:t xml:space="preserve">Attendance and Absent</w:t>
+      </w:r>
+    </w:p>
+    <w:p>
+      <w:pPr>
+        <w:pStyle w:val="Compact"/>
+        <w:numPr>
+          <w:ilvl w:val="0"/>
+          <w:numId w:val="1022"/>
+        </w:numPr>
+      </w:pPr>
+      <w:r>
+        <w:t xml:space="preserve">Integrity</w:t>
+      </w:r>
+    </w:p>
+    <w:p>
+      <w:pPr>
+        <w:pStyle w:val="Compact"/>
+        <w:numPr>
+          <w:ilvl w:val="0"/>
+          <w:numId w:val="1022"/>
+        </w:numPr>
+      </w:pPr>
+      <w:r>
+        <w:t xml:space="preserve">AI Usage</w:t>
+      </w:r>
+    </w:p>
+    <w:bookmarkStart w:id="46" w:name="in-class"/>
     <w:p>
       <w:pPr>
         <w:pStyle w:val="Heading2"/>
       </w:pPr>
       <w:r>
-        <w:t xml:space="preserve">Chapter 2: Formulating a Research Question</w:t>
-      </w:r>
-    </w:p>
-    <w:p>
-      <w:pPr>
-        <w:pStyle w:val="Compact"/>
-        <w:numPr>
-          <w:ilvl w:val="0"/>
-          <w:numId w:val="1011"/>
-        </w:numPr>
-      </w:pPr>
-      <w:r>
-        <w:t xml:space="preserve">Choose a research topic.</w:t>
-      </w:r>
-    </w:p>
-    <w:p>
-      <w:pPr>
-        <w:pStyle w:val="Compact"/>
-        <w:numPr>
-          <w:ilvl w:val="0"/>
-          <w:numId w:val="1011"/>
-        </w:numPr>
-      </w:pPr>
-      <w:r>
-        <w:t xml:space="preserve">Explain how to operationalize research constructs</w:t>
-      </w:r>
-    </w:p>
-    <w:p>
-      <w:pPr>
-        <w:pStyle w:val="Compact"/>
-        <w:numPr>
-          <w:ilvl w:val="0"/>
-          <w:numId w:val="1011"/>
-        </w:numPr>
-      </w:pPr>
-      <w:r>
-        <w:t xml:space="preserve">Describe the different types of variables</w:t>
-      </w:r>
-    </w:p>
-    <w:p>
-      <w:pPr>
-        <w:pStyle w:val="Compact"/>
-        <w:numPr>
-          <w:ilvl w:val="0"/>
-          <w:numId w:val="1011"/>
-        </w:numPr>
-      </w:pPr>
-      <w:r>
-        <w:t xml:space="preserve">Formulate the various types of hypotheses</w:t>
-      </w:r>
-    </w:p>
-    <w:p>
-      <w:pPr>
-        <w:pStyle w:val="Compact"/>
-        <w:numPr>
-          <w:ilvl w:val="0"/>
-          <w:numId w:val="1011"/>
-        </w:numPr>
-      </w:pPr>
-      <w:r>
-        <w:t xml:space="preserve">Create a visualization of a research question</w:t>
-      </w:r>
-    </w:p>
-    <w:bookmarkEnd w:id="43"/>
-    <w:bookmarkStart w:id="44" w:name="Xca44ce7efd519fd6eea8724d5102b557c22c8a3"/>
-    <w:p>
-      <w:pPr>
-        <w:pStyle w:val="Heading2"/>
-      </w:pPr>
-      <w:r>
-        <w:t xml:space="preserve">Chapter 3: Researching and Writing the Literature</w:t>
-      </w:r>
-    </w:p>
-    <w:p>
-      <w:pPr>
-        <w:pStyle w:val="Compact"/>
-        <w:numPr>
-          <w:ilvl w:val="0"/>
-          <w:numId w:val="1012"/>
-        </w:numPr>
-      </w:pPr>
-      <w:r>
-        <w:t xml:space="preserve">Describe the purpose of a literature review</w:t>
-      </w:r>
-    </w:p>
-    <w:p>
-      <w:pPr>
-        <w:pStyle w:val="Compact"/>
-        <w:numPr>
-          <w:ilvl w:val="0"/>
-          <w:numId w:val="1012"/>
-        </w:numPr>
-      </w:pPr>
-      <w:r>
-        <w:t xml:space="preserve">Learn about online databases as resources</w:t>
-      </w:r>
-    </w:p>
-    <w:p>
-      <w:pPr>
-        <w:pStyle w:val="Compact"/>
-        <w:numPr>
-          <w:ilvl w:val="0"/>
-          <w:numId w:val="1012"/>
-        </w:numPr>
-      </w:pPr>
-      <w:r>
-        <w:t xml:space="preserve">Examine different ways of organizing a literature review</w:t>
-      </w:r>
-    </w:p>
-    <w:p>
-      <w:pPr>
-        <w:pStyle w:val="Compact"/>
-        <w:numPr>
-          <w:ilvl w:val="0"/>
-          <w:numId w:val="1012"/>
-        </w:numPr>
-      </w:pPr>
-      <w:r>
-        <w:t xml:space="preserve">Discuss how to think critically and analyze studies</w:t>
-      </w:r>
-    </w:p>
-    <w:p>
-      <w:pPr>
-        <w:pStyle w:val="Compact"/>
-        <w:numPr>
-          <w:ilvl w:val="0"/>
-          <w:numId w:val="1012"/>
-        </w:numPr>
-      </w:pPr>
-      <w:r>
-        <w:t xml:space="preserve">Identify the correct placement of study hypotheses</w:t>
-      </w:r>
-    </w:p>
-    <w:p>
-      <w:pPr>
-        <w:pStyle w:val="Compact"/>
-        <w:numPr>
-          <w:ilvl w:val="0"/>
-          <w:numId w:val="1012"/>
-        </w:numPr>
-      </w:pPr>
-      <w:r>
-        <w:t xml:space="preserve">Compare and contrast a systematic review of the literature and a literature review</w:t>
-      </w:r>
-    </w:p>
-    <w:bookmarkEnd w:id="44"/>
-    <w:bookmarkStart w:id="45" w:name="chapter-4-quantitative-designs"/>
-    <w:p>
-      <w:pPr>
-        <w:pStyle w:val="Heading2"/>
-      </w:pPr>
-      <w:r>
-        <w:t xml:space="preserve">Chapter 4: Quantitative Designs</w:t>
-      </w:r>
-    </w:p>
-    <w:p>
-      <w:pPr>
-        <w:pStyle w:val="Compact"/>
-        <w:numPr>
-          <w:ilvl w:val="0"/>
-          <w:numId w:val="1013"/>
-        </w:numPr>
-      </w:pPr>
-      <w:r>
-        <w:t xml:space="preserve">Describe the purpose of exploratory, descriptive, and explanatory studies.</w:t>
-      </w:r>
-    </w:p>
-    <w:p>
-      <w:pPr>
-        <w:pStyle w:val="Compact"/>
-        <w:numPr>
-          <w:ilvl w:val="0"/>
-          <w:numId w:val="1013"/>
-        </w:numPr>
-      </w:pPr>
-      <w:r>
-        <w:t xml:space="preserve">Compare and contrast cross-sectional and longitudinal studies.</w:t>
-      </w:r>
-    </w:p>
-    <w:p>
-      <w:pPr>
-        <w:pStyle w:val="Compact"/>
-        <w:numPr>
-          <w:ilvl w:val="0"/>
-          <w:numId w:val="1013"/>
-        </w:numPr>
-      </w:pPr>
-      <w:r>
-        <w:t xml:space="preserve">Explain the differences between nomothetic research and idiographic research.</w:t>
-      </w:r>
-    </w:p>
-    <w:p>
-      <w:pPr>
-        <w:pStyle w:val="Compact"/>
-        <w:numPr>
-          <w:ilvl w:val="0"/>
-          <w:numId w:val="1013"/>
-        </w:numPr>
-      </w:pPr>
-      <w:r>
-        <w:t xml:space="preserve">Discuss each type of experimental design and its advantages and disadvantages.</w:t>
-      </w:r>
-    </w:p>
-    <w:bookmarkEnd w:id="45"/>
-    <w:bookmarkStart w:id="46" w:name="X090f2c56f796154834dedd0d649791516b3b96a"/>
-    <w:p>
-      <w:pPr>
-        <w:pStyle w:val="Heading2"/>
-      </w:pPr>
-      <w:r>
-        <w:t xml:space="preserve">Chapter 5: Measurement Errors, Reliability, Validity</w:t>
-      </w:r>
-    </w:p>
-    <w:p>
-      <w:pPr>
-        <w:pStyle w:val="Compact"/>
-        <w:numPr>
-          <w:ilvl w:val="0"/>
-          <w:numId w:val="1014"/>
-        </w:numPr>
-      </w:pPr>
-      <w:r>
-        <w:t xml:space="preserve">Recognize measurement errors and describe how to categorize them.</w:t>
-      </w:r>
-    </w:p>
-    <w:p>
-      <w:pPr>
-        <w:pStyle w:val="Compact"/>
-        <w:numPr>
-          <w:ilvl w:val="0"/>
-          <w:numId w:val="1014"/>
-        </w:numPr>
-      </w:pPr>
-      <w:r>
-        <w:t xml:space="preserve">Compare and contrast the interrater reliability, test-retest reliability, and internal consistency reliability.</w:t>
-      </w:r>
-    </w:p>
-    <w:p>
-      <w:pPr>
-        <w:pStyle w:val="Compact"/>
-        <w:numPr>
-          <w:ilvl w:val="0"/>
-          <w:numId w:val="1014"/>
-        </w:numPr>
-      </w:pPr>
-      <w:r>
-        <w:t xml:space="preserve">Analyze the different types of validity: face validity, content validity, construct validity, criterion validity, concurrent validity, and predictive validity.</w:t>
-      </w:r>
-    </w:p>
-    <w:bookmarkEnd w:id="46"/>
-    <w:bookmarkStart w:id="47" w:name="chapter-6-sampling"/>
-    <w:p>
-      <w:pPr>
-        <w:pStyle w:val="Heading2"/>
-      </w:pPr>
-      <w:r>
-        <w:t xml:space="preserve">Chapter 6: Sampling</w:t>
-      </w:r>
-    </w:p>
-    <w:p>
-      <w:pPr>
-        <w:pStyle w:val="Compact"/>
-        <w:numPr>
-          <w:ilvl w:val="0"/>
-          <w:numId w:val="1015"/>
-        </w:numPr>
-      </w:pPr>
-      <w:r>
-        <w:t xml:space="preserve">Explain the purpose of sampling.</w:t>
-      </w:r>
-    </w:p>
-    <w:p>
-      <w:pPr>
-        <w:pStyle w:val="Compact"/>
-        <w:numPr>
-          <w:ilvl w:val="0"/>
-          <w:numId w:val="1015"/>
-        </w:numPr>
-      </w:pPr>
-      <w:r>
-        <w:t xml:space="preserve">Compare and contrast probability and nonprobability sampling.</w:t>
-      </w:r>
-    </w:p>
-    <w:p>
-      <w:pPr>
-        <w:pStyle w:val="Compact"/>
-        <w:numPr>
-          <w:ilvl w:val="0"/>
-          <w:numId w:val="1015"/>
-        </w:numPr>
-      </w:pPr>
-      <w:r>
-        <w:t xml:space="preserve">Describe the types of nonprobability sampling.</w:t>
-      </w:r>
-    </w:p>
-    <w:p>
-      <w:pPr>
-        <w:pStyle w:val="Compact"/>
-        <w:numPr>
-          <w:ilvl w:val="0"/>
-          <w:numId w:val="1015"/>
-        </w:numPr>
-      </w:pPr>
-      <w:r>
-        <w:t xml:space="preserve">Summarize the types of probability sampling.</w:t>
-      </w:r>
-    </w:p>
-    <w:p>
-      <w:pPr>
-        <w:pStyle w:val="Compact"/>
-        <w:numPr>
-          <w:ilvl w:val="0"/>
-          <w:numId w:val="1015"/>
-        </w:numPr>
-      </w:pPr>
-      <w:r>
-        <w:t xml:space="preserve">Understand sampling error, confidence interval, and saturation.</w:t>
-      </w:r>
-    </w:p>
-    <w:bookmarkEnd w:id="47"/>
-    <w:bookmarkStart w:id="48" w:name="Xc61594af4cdf33d6d90e840b66a879bef79762a"/>
-    <w:p>
-      <w:pPr>
-        <w:pStyle w:val="Heading2"/>
-      </w:pPr>
-      <w:r>
-        <w:t xml:space="preserve">Chapter 7: Data Collection for Quantitative Research</w:t>
-      </w:r>
-    </w:p>
-    <w:p>
-      <w:pPr>
-        <w:pStyle w:val="Compact"/>
-        <w:numPr>
-          <w:ilvl w:val="0"/>
-          <w:numId w:val="1016"/>
-        </w:numPr>
-      </w:pPr>
-      <w:r>
-        <w:t xml:space="preserve">Familiarize yourself with the details of experimental design.</w:t>
-      </w:r>
-    </w:p>
-    <w:p>
-      <w:pPr>
-        <w:pStyle w:val="Compact"/>
-        <w:numPr>
-          <w:ilvl w:val="0"/>
-          <w:numId w:val="1016"/>
-        </w:numPr>
-      </w:pPr>
-      <w:r>
-        <w:t xml:space="preserve">Familiarize yourself with the details of quasi-experimental design.</w:t>
-      </w:r>
-    </w:p>
-    <w:p>
-      <w:pPr>
-        <w:pStyle w:val="Compact"/>
-        <w:numPr>
-          <w:ilvl w:val="0"/>
-          <w:numId w:val="1016"/>
-        </w:numPr>
-      </w:pPr>
-      <w:r>
-        <w:t xml:space="preserve">Understand the steps of designing a survey study.</w:t>
-      </w:r>
-    </w:p>
-    <w:p>
-      <w:pPr>
-        <w:pStyle w:val="Compact"/>
-        <w:numPr>
-          <w:ilvl w:val="0"/>
-          <w:numId w:val="1016"/>
-        </w:numPr>
-      </w:pPr>
-      <w:r>
-        <w:t xml:space="preserve">Consider additional data collection sources.</w:t>
-      </w:r>
-    </w:p>
-    <w:bookmarkEnd w:id="48"/>
-    <w:bookmarkStart w:id="49" w:name="chapter-8-secondary-data"/>
-    <w:p>
-      <w:pPr>
-        <w:pStyle w:val="Heading2"/>
-      </w:pPr>
-      <w:r>
-        <w:t xml:space="preserve">Chapter 8: Secondary Data</w:t>
-      </w:r>
-    </w:p>
-    <w:p>
-      <w:pPr>
-        <w:pStyle w:val="Compact"/>
-        <w:numPr>
-          <w:ilvl w:val="0"/>
-          <w:numId w:val="1017"/>
-        </w:numPr>
-      </w:pPr>
-      <w:r>
-        <w:t xml:space="preserve">Describe the benefits of using secondary data.</w:t>
-      </w:r>
-    </w:p>
-    <w:p>
-      <w:pPr>
-        <w:pStyle w:val="Compact"/>
-        <w:numPr>
-          <w:ilvl w:val="0"/>
-          <w:numId w:val="1017"/>
-        </w:numPr>
-      </w:pPr>
-      <w:r>
-        <w:t xml:space="preserve">Identify the major sources of secondary data.</w:t>
-      </w:r>
-    </w:p>
-    <w:p>
-      <w:pPr>
-        <w:pStyle w:val="Compact"/>
-        <w:numPr>
-          <w:ilvl w:val="0"/>
-          <w:numId w:val="1017"/>
-        </w:numPr>
-      </w:pPr>
-      <w:r>
-        <w:t xml:space="preserve">Explain the drawbacks of using secondary data.</w:t>
-      </w:r>
-    </w:p>
-    <w:bookmarkEnd w:id="49"/>
-    <w:bookmarkStart w:id="50" w:name="X1c9fd225da848838346088731e2d97a61c3fe15"/>
-    <w:p>
-      <w:pPr>
-        <w:pStyle w:val="Heading2"/>
-      </w:pPr>
-      <w:r>
-        <w:t xml:space="preserve">Chapter 9: Entering and Organizing Quantitative Data</w:t>
-      </w:r>
-    </w:p>
-    <w:p>
-      <w:pPr>
-        <w:pStyle w:val="Compact"/>
-        <w:numPr>
-          <w:ilvl w:val="0"/>
-          <w:numId w:val="1018"/>
-        </w:numPr>
-      </w:pPr>
-      <w:r>
-        <w:t xml:space="preserve">Explain the purpose of entering and organizing data logically.</w:t>
-      </w:r>
-    </w:p>
-    <w:p>
-      <w:pPr>
-        <w:pStyle w:val="Compact"/>
-        <w:numPr>
-          <w:ilvl w:val="0"/>
-          <w:numId w:val="1018"/>
-        </w:numPr>
-      </w:pPr>
-      <w:r>
-        <w:t xml:space="preserve">Summarize the steps needed to prepare to enter data.</w:t>
-      </w:r>
-    </w:p>
-    <w:p>
-      <w:pPr>
-        <w:pStyle w:val="Compact"/>
-        <w:numPr>
-          <w:ilvl w:val="0"/>
-          <w:numId w:val="1018"/>
-        </w:numPr>
-      </w:pPr>
-      <w:r>
-        <w:t xml:space="preserve">Describe how to organize and input variables and their information.</w:t>
-      </w:r>
-    </w:p>
-    <w:bookmarkEnd w:id="50"/>
-    <w:bookmarkStart w:id="51" w:name="chapter-10-analyzing-quantitative-data"/>
-    <w:p>
-      <w:pPr>
-        <w:pStyle w:val="Heading2"/>
-      </w:pPr>
-      <w:r>
-        <w:t xml:space="preserve">Chapter 10: Analyzing Quantitative Data</w:t>
-      </w:r>
-    </w:p>
-    <w:p>
-      <w:pPr>
-        <w:pStyle w:val="Compact"/>
-        <w:numPr>
-          <w:ilvl w:val="0"/>
-          <w:numId w:val="1019"/>
-        </w:numPr>
-      </w:pPr>
-      <w:r>
-        <w:t xml:space="preserve">Summarize why statistics are used in research methods</w:t>
-      </w:r>
-    </w:p>
-    <w:p>
-      <w:pPr>
-        <w:pStyle w:val="Compact"/>
-        <w:numPr>
-          <w:ilvl w:val="0"/>
-          <w:numId w:val="1019"/>
-        </w:numPr>
-      </w:pPr>
-      <w:r>
-        <w:t xml:space="preserve">Conduct univariate analysis</w:t>
-      </w:r>
-    </w:p>
-    <w:p>
-      <w:pPr>
-        <w:pStyle w:val="Compact"/>
-        <w:numPr>
-          <w:ilvl w:val="0"/>
-          <w:numId w:val="1019"/>
-        </w:numPr>
-      </w:pPr>
-      <w:r>
-        <w:t xml:space="preserve">Explain the measures of central tendency</w:t>
-      </w:r>
-    </w:p>
-    <w:p>
-      <w:pPr>
-        <w:pStyle w:val="Compact"/>
-        <w:numPr>
-          <w:ilvl w:val="0"/>
-          <w:numId w:val="1019"/>
-        </w:numPr>
-      </w:pPr>
-      <w:r>
-        <w:t xml:space="preserve">Define measures of variability and dispersion</w:t>
-      </w:r>
-    </w:p>
-    <w:p>
-      <w:pPr>
-        <w:pStyle w:val="Compact"/>
-        <w:numPr>
-          <w:ilvl w:val="0"/>
-          <w:numId w:val="1019"/>
-        </w:numPr>
-      </w:pPr>
-      <w:r>
-        <w:t xml:space="preserve">Describe the various ways to graphically represent data</w:t>
-      </w:r>
-    </w:p>
-    <w:p>
-      <w:pPr>
-        <w:pStyle w:val="Compact"/>
-        <w:numPr>
-          <w:ilvl w:val="0"/>
-          <w:numId w:val="1019"/>
-        </w:numPr>
-      </w:pPr>
-      <w:r>
-        <w:t xml:space="preserve">Conduct bivariate analysis</w:t>
-      </w:r>
-    </w:p>
-    <w:bookmarkEnd w:id="51"/>
-    <w:bookmarkStart w:id="52" w:name="X97a87459aed2a575cef74a1ab02a10216e96f17"/>
-    <w:p>
-      <w:pPr>
-        <w:pStyle w:val="Heading2"/>
-      </w:pPr>
-      <w:r>
-        <w:t xml:space="preserve">Chapter 11: Qualitative Designs And Data Collection</w:t>
-      </w:r>
-    </w:p>
-    <w:p>
-      <w:pPr>
-        <w:pStyle w:val="Compact"/>
-        <w:numPr>
-          <w:ilvl w:val="0"/>
-          <w:numId w:val="1020"/>
-        </w:numPr>
-      </w:pPr>
-      <w:r>
-        <w:t xml:space="preserve">Plan a qualitative study in a community that is not well known or understood.</w:t>
-      </w:r>
-    </w:p>
-    <w:p>
-      <w:pPr>
-        <w:pStyle w:val="Compact"/>
-        <w:numPr>
-          <w:ilvl w:val="0"/>
-          <w:numId w:val="1020"/>
-        </w:numPr>
-      </w:pPr>
-      <w:r>
-        <w:t xml:space="preserve">Understand that qualitative research and quantitative research are not opposed.</w:t>
-      </w:r>
-    </w:p>
-    <w:p>
-      <w:pPr>
-        <w:pStyle w:val="Compact"/>
-        <w:numPr>
-          <w:ilvl w:val="0"/>
-          <w:numId w:val="1020"/>
-        </w:numPr>
-      </w:pPr>
-      <w:r>
-        <w:t xml:space="preserve">Do participant observation, write field notes, and manage them in a database.</w:t>
-      </w:r>
-    </w:p>
-    <w:p>
-      <w:pPr>
-        <w:pStyle w:val="Compact"/>
-        <w:numPr>
-          <w:ilvl w:val="0"/>
-          <w:numId w:val="1020"/>
-        </w:numPr>
-      </w:pPr>
-      <w:r>
-        <w:t xml:space="preserve">Collect other data, like artifacts, photos, and videos; texts can also be collected.</w:t>
-      </w:r>
-    </w:p>
-    <w:bookmarkEnd w:id="52"/>
-    <w:bookmarkStart w:id="53" w:name="X10d37152ece273ca1aa8051e73b79ec488abac2"/>
-    <w:p>
-      <w:pPr>
-        <w:pStyle w:val="Heading2"/>
-      </w:pPr>
-      <w:r>
-        <w:t xml:space="preserve">Chapter 12: Entering, Coding, and Analyzing Qualitative Data</w:t>
-      </w:r>
-    </w:p>
-    <w:p>
-      <w:pPr>
-        <w:pStyle w:val="Compact"/>
-        <w:numPr>
-          <w:ilvl w:val="0"/>
-          <w:numId w:val="1021"/>
-        </w:numPr>
-      </w:pPr>
-      <w:r>
-        <w:t xml:space="preserve">Describe how to enter, clean, and organize qualitative data.</w:t>
-      </w:r>
-    </w:p>
-    <w:p>
-      <w:pPr>
-        <w:pStyle w:val="Compact"/>
-        <w:numPr>
-          <w:ilvl w:val="0"/>
-          <w:numId w:val="1021"/>
-        </w:numPr>
-      </w:pPr>
-      <w:r>
-        <w:t xml:space="preserve">Examine and code raw data.</w:t>
-      </w:r>
-    </w:p>
-    <w:p>
-      <w:pPr>
-        <w:pStyle w:val="Compact"/>
-        <w:numPr>
-          <w:ilvl w:val="0"/>
-          <w:numId w:val="1021"/>
-        </w:numPr>
-      </w:pPr>
-      <w:r>
-        <w:t xml:space="preserve">Analyze qualitative data.</w:t>
-      </w:r>
-    </w:p>
-    <w:bookmarkEnd w:id="53"/>
-    <w:bookmarkStart w:id="54" w:name="chapter-13-results-and-discussion"/>
-    <w:p>
-      <w:pPr>
-        <w:pStyle w:val="Heading2"/>
-      </w:pPr>
-      <w:r>
-        <w:t xml:space="preserve">Chapter 13: Results and Discussion</w:t>
-      </w:r>
-    </w:p>
-    <w:p>
-      <w:pPr>
-        <w:pStyle w:val="Compact"/>
-        <w:numPr>
-          <w:ilvl w:val="0"/>
-          <w:numId w:val="1022"/>
-        </w:numPr>
-      </w:pPr>
-      <w:r>
-        <w:t xml:space="preserve">Write a results section.</w:t>
-      </w:r>
-    </w:p>
-    <w:p>
-      <w:pPr>
-        <w:pStyle w:val="Compact"/>
-        <w:numPr>
-          <w:ilvl w:val="0"/>
-          <w:numId w:val="1022"/>
-        </w:numPr>
-      </w:pPr>
-      <w:r>
-        <w:t xml:space="preserve">Describe how to present results in quantitative studies.</w:t>
-      </w:r>
-    </w:p>
-    <w:p>
-      <w:pPr>
-        <w:pStyle w:val="Compact"/>
-        <w:numPr>
-          <w:ilvl w:val="0"/>
-          <w:numId w:val="1022"/>
-        </w:numPr>
-      </w:pPr>
-      <w:r>
-        <w:t xml:space="preserve">Explain how to present results in qualitative studies.</w:t>
-      </w:r>
-    </w:p>
-    <w:p>
-      <w:pPr>
-        <w:pStyle w:val="Compact"/>
-        <w:numPr>
-          <w:ilvl w:val="0"/>
-          <w:numId w:val="1022"/>
-        </w:numPr>
-      </w:pPr>
-      <w:r>
-        <w:t xml:space="preserve">Prepare visual representations of results.</w:t>
-      </w:r>
-    </w:p>
-    <w:p>
-      <w:pPr>
-        <w:pStyle w:val="Compact"/>
-        <w:numPr>
-          <w:ilvl w:val="0"/>
-          <w:numId w:val="1022"/>
-        </w:numPr>
-      </w:pPr>
-      <w:r>
-        <w:t xml:space="preserve">Compose a discussion section.</w:t>
-      </w:r>
-    </w:p>
-    <w:p>
-      <w:pPr>
-        <w:pStyle w:val="Compact"/>
-        <w:numPr>
-          <w:ilvl w:val="0"/>
-          <w:numId w:val="1022"/>
-        </w:numPr>
-      </w:pPr>
-      <w:r>
-        <w:t xml:space="preserve">Develop a recommendations section based on methodology or topic.</w:t>
-      </w:r>
-    </w:p>
-    <w:bookmarkEnd w:id="54"/>
-    <w:bookmarkStart w:id="55" w:name="chapter-14-presenting-your-research"/>
-    <w:p>
-      <w:pPr>
-        <w:pStyle w:val="Heading2"/>
-      </w:pPr>
-      <w:r>
-        <w:t xml:space="preserve">Chapter 14: Presenting Your Research</w:t>
+        <w:t xml:space="preserve">In Class</w:t>
       </w:r>
     </w:p>
     <w:p>
@@ -1578,7 +1369,7 @@
         </w:numPr>
       </w:pPr>
       <w:r>
-        <w:t xml:space="preserve">Explain how best to present your study to an audience.</w:t>
+        <w:t xml:space="preserve">You are expected to read chapter and course material before class</w:t>
       </w:r>
     </w:p>
     <w:p>
@@ -1590,7 +1381,7 @@
         </w:numPr>
       </w:pPr>
       <w:r>
-        <w:t xml:space="preserve">Discuss how to apply to regional and national conferences.</w:t>
+        <w:t xml:space="preserve">Based on your class participation, you will get extra score</w:t>
       </w:r>
     </w:p>
     <w:p>
@@ -1599,166 +1390,6 @@
         <w:numPr>
           <w:ilvl w:val="0"/>
           <w:numId w:val="1023"/>
-        </w:numPr>
-      </w:pPr>
-      <w:r>
-        <w:t xml:space="preserve">Describe how to get an article published in a peer-reviewed journal.</w:t>
-      </w:r>
-    </w:p>
-    <w:bookmarkEnd w:id="55"/>
-    <w:bookmarkEnd w:id="56"/>
-    <w:bookmarkStart w:id="58" w:name="course-information-and-syllabus"/>
-    <w:p>
-      <w:pPr>
-        <w:pStyle w:val="Heading1"/>
-      </w:pPr>
-      <w:r>
-        <w:t xml:space="preserve">Course Information and Syllabus</w:t>
-      </w:r>
-    </w:p>
-    <w:bookmarkStart w:id="57" w:name="class-information"/>
-    <w:p>
-      <w:pPr>
-        <w:pStyle w:val="Heading2"/>
-      </w:pPr>
-      <w:r>
-        <w:t xml:space="preserve">Class Information</w:t>
-      </w:r>
-    </w:p>
-    <w:p>
-      <w:pPr>
-        <w:pStyle w:val="Compact"/>
-        <w:numPr>
-          <w:ilvl w:val="0"/>
-          <w:numId w:val="1024"/>
-        </w:numPr>
-      </w:pPr>
-      <w:r>
-        <w:t xml:space="preserve">GE 2021 W09: Research Technology</w:t>
-      </w:r>
-    </w:p>
-    <w:p>
-      <w:pPr>
-        <w:pStyle w:val="Compact"/>
-        <w:numPr>
-          <w:ilvl w:val="0"/>
-          <w:numId w:val="1024"/>
-        </w:numPr>
-      </w:pPr>
-      <w:r>
-        <w:t xml:space="preserve">Class time: T, TH 1:00 pm - 2:15 pm</w:t>
-      </w:r>
-    </w:p>
-    <w:p>
-      <w:pPr>
-        <w:pStyle w:val="Compact"/>
-        <w:numPr>
-          <w:ilvl w:val="0"/>
-          <w:numId w:val="1024"/>
-        </w:numPr>
-      </w:pPr>
-      <w:r>
-        <w:t xml:space="preserve">Class room: CBPM C423</w:t>
-      </w:r>
-    </w:p>
-    <w:bookmarkEnd w:id="57"/>
-    <w:bookmarkEnd w:id="58"/>
-    <w:bookmarkStart w:id="65" w:name="house-rule"/>
-    <w:p>
-      <w:pPr>
-        <w:pStyle w:val="Heading1"/>
-      </w:pPr>
-      <w:r>
-        <w:t xml:space="preserve">House Rule</w:t>
-      </w:r>
-    </w:p>
-    <w:p>
-      <w:pPr>
-        <w:pStyle w:val="Compact"/>
-        <w:numPr>
-          <w:ilvl w:val="0"/>
-          <w:numId w:val="1025"/>
-        </w:numPr>
-      </w:pPr>
-      <w:r>
-        <w:t xml:space="preserve">In class</w:t>
-      </w:r>
-    </w:p>
-    <w:p>
-      <w:pPr>
-        <w:pStyle w:val="Compact"/>
-        <w:numPr>
-          <w:ilvl w:val="0"/>
-          <w:numId w:val="1025"/>
-        </w:numPr>
-      </w:pPr>
-      <w:r>
-        <w:t xml:space="preserve">Attendence and Absent</w:t>
-      </w:r>
-    </w:p>
-    <w:p>
-      <w:pPr>
-        <w:pStyle w:val="Compact"/>
-        <w:numPr>
-          <w:ilvl w:val="0"/>
-          <w:numId w:val="1025"/>
-        </w:numPr>
-      </w:pPr>
-      <w:r>
-        <w:t xml:space="preserve">Integration</w:t>
-      </w:r>
-    </w:p>
-    <w:p>
-      <w:pPr>
-        <w:pStyle w:val="Compact"/>
-        <w:numPr>
-          <w:ilvl w:val="0"/>
-          <w:numId w:val="1025"/>
-        </w:numPr>
-      </w:pPr>
-      <w:r>
-        <w:t xml:space="preserve">AI Useges</w:t>
-      </w:r>
-    </w:p>
-    <w:bookmarkStart w:id="59" w:name="in-class"/>
-    <w:p>
-      <w:pPr>
-        <w:pStyle w:val="Heading2"/>
-      </w:pPr>
-      <w:r>
-        <w:t xml:space="preserve">In CLass</w:t>
-      </w:r>
-    </w:p>
-    <w:p>
-      <w:pPr>
-        <w:pStyle w:val="Compact"/>
-        <w:numPr>
-          <w:ilvl w:val="0"/>
-          <w:numId w:val="1026"/>
-        </w:numPr>
-      </w:pPr>
-      <w:r>
-        <w:t xml:space="preserve">You are expected to read chapter and course material before class</w:t>
-      </w:r>
-    </w:p>
-    <w:p>
-      <w:pPr>
-        <w:pStyle w:val="Compact"/>
-        <w:numPr>
-          <w:ilvl w:val="0"/>
-          <w:numId w:val="1026"/>
-        </w:numPr>
-      </w:pPr>
-      <w:r>
-        <w:t xml:space="preserve">Based on your class participation, you will get extra score</w:t>
-      </w:r>
-    </w:p>
-    <w:p>
-      <w:pPr>
-        <w:pStyle w:val="Compact"/>
-        <w:numPr>
-          <w:ilvl w:val="0"/>
-          <w:numId w:val="1026"/>
         </w:numPr>
       </w:pPr>
       <w:r>
@@ -1786,29 +1417,29 @@
         <w:pStyle w:val="Compact"/>
         <w:numPr>
           <w:ilvl w:val="0"/>
-          <w:numId w:val="1026"/>
-        </w:numPr>
-      </w:pPr>
-      <w:r>
-        <w:t xml:space="preserve">In case instuctor find unauthorized useage of digital device, you will be asked to leave class.</w:t>
-      </w:r>
-    </w:p>
-    <w:bookmarkEnd w:id="59"/>
-    <w:bookmarkStart w:id="60" w:name="attendence-and-absent"/>
+          <w:numId w:val="1023"/>
+        </w:numPr>
+      </w:pPr>
+      <w:r>
+        <w:t xml:space="preserve">In case the instructor finds unauthorized usage of digital device, you will be asked to leave class.</w:t>
+      </w:r>
+    </w:p>
+    <w:bookmarkEnd w:id="46"/>
+    <w:bookmarkStart w:id="47" w:name="attendance-and-absent"/>
     <w:p>
       <w:pPr>
         <w:pStyle w:val="Heading2"/>
       </w:pPr>
       <w:r>
-        <w:t xml:space="preserve">Attendence and Absent</w:t>
-      </w:r>
-    </w:p>
-    <w:p>
-      <w:pPr>
-        <w:pStyle w:val="Compact"/>
-        <w:numPr>
-          <w:ilvl w:val="0"/>
-          <w:numId w:val="1027"/>
+        <w:t xml:space="preserve">Attendance and Absent</w:t>
+      </w:r>
+    </w:p>
+    <w:p>
+      <w:pPr>
+        <w:pStyle w:val="Compact"/>
+        <w:numPr>
+          <w:ilvl w:val="0"/>
+          <w:numId w:val="1024"/>
         </w:numPr>
       </w:pPr>
       <w:r>
@@ -1816,15 +1447,15 @@
           <w:b/>
           <w:bCs/>
         </w:rPr>
-        <w:t xml:space="preserve">DON”T SENT ME EMAIL or ANY MESSAGE about YOUR ABSENT in ADVANCE</w:t>
-      </w:r>
-    </w:p>
-    <w:p>
-      <w:pPr>
-        <w:pStyle w:val="Compact"/>
-        <w:numPr>
-          <w:ilvl w:val="0"/>
-          <w:numId w:val="1027"/>
+        <w:t xml:space="preserve">DON’T SEND ME EMAIL or ANY MESSAGE about YOUR ABSENCE in ADVANCE</w:t>
+      </w:r>
+    </w:p>
+    <w:p>
+      <w:pPr>
+        <w:pStyle w:val="Compact"/>
+        <w:numPr>
+          <w:ilvl w:val="0"/>
+          <w:numId w:val="1024"/>
         </w:numPr>
       </w:pPr>
       <w:r>
@@ -1836,53 +1467,53 @@
         <w:pStyle w:val="Compact"/>
         <w:numPr>
           <w:ilvl w:val="0"/>
-          <w:numId w:val="1027"/>
-        </w:numPr>
-      </w:pPr>
-      <w:r>
-        <w:t xml:space="preserve">Attendence will be managed in student performance application</w:t>
-      </w:r>
-    </w:p>
-    <w:p>
-      <w:pPr>
-        <w:pStyle w:val="Compact"/>
-        <w:numPr>
-          <w:ilvl w:val="0"/>
-          <w:numId w:val="1027"/>
-        </w:numPr>
-      </w:pPr>
-      <w:r>
-        <w:t xml:space="preserve">When instructor or TA check your attendence and if you are not in class, no matter what reason, your attendence will be marked as absent.</w:t>
-      </w:r>
-    </w:p>
-    <w:p>
-      <w:pPr>
-        <w:pStyle w:val="Compact"/>
-        <w:numPr>
-          <w:ilvl w:val="0"/>
-          <w:numId w:val="1027"/>
-        </w:numPr>
-      </w:pPr>
-      <w:r>
-        <w:t xml:space="preserve">However, if you have proper and official evidence that WKU allow for absent, bring it to your instructor for revise your absent mark to attendece.</w:t>
-      </w:r>
-    </w:p>
-    <w:bookmarkEnd w:id="60"/>
-    <w:bookmarkStart w:id="62" w:name="integration"/>
+          <w:numId w:val="1024"/>
+        </w:numPr>
+      </w:pPr>
+      <w:r>
+        <w:t xml:space="preserve">Attendance will be managed in student performance application</w:t>
+      </w:r>
+    </w:p>
+    <w:p>
+      <w:pPr>
+        <w:pStyle w:val="Compact"/>
+        <w:numPr>
+          <w:ilvl w:val="0"/>
+          <w:numId w:val="1024"/>
+        </w:numPr>
+      </w:pPr>
+      <w:r>
+        <w:t xml:space="preserve">When instructor or TA check your attendance and if you are not in class, no matter what reason, your attendance will be marked as absent.</w:t>
+      </w:r>
+    </w:p>
+    <w:p>
+      <w:pPr>
+        <w:pStyle w:val="Compact"/>
+        <w:numPr>
+          <w:ilvl w:val="0"/>
+          <w:numId w:val="1024"/>
+        </w:numPr>
+      </w:pPr>
+      <w:r>
+        <w:t xml:space="preserve">However, if you have proper and official evidence that WKU allow for absent, bring it to your instructor for revise your absent mark to attendance.</w:t>
+      </w:r>
+    </w:p>
+    <w:bookmarkEnd w:id="47"/>
+    <w:bookmarkStart w:id="49" w:name="integrity"/>
     <w:p>
       <w:pPr>
         <w:pStyle w:val="Heading2"/>
       </w:pPr>
       <w:r>
-        <w:t xml:space="preserve">Integration</w:t>
-      </w:r>
-    </w:p>
-    <w:p>
-      <w:pPr>
-        <w:pStyle w:val="Compact"/>
-        <w:numPr>
-          <w:ilvl w:val="0"/>
-          <w:numId w:val="1028"/>
+        <w:t xml:space="preserve">Integrity</w:t>
+      </w:r>
+    </w:p>
+    <w:p>
+      <w:pPr>
+        <w:pStyle w:val="Compact"/>
+        <w:numPr>
+          <w:ilvl w:val="0"/>
+          <w:numId w:val="1025"/>
         </w:numPr>
       </w:pPr>
       <w:r>
@@ -1894,7 +1525,7 @@
         <w:pStyle w:val="Compact"/>
         <w:numPr>
           <w:ilvl w:val="1"/>
-          <w:numId w:val="1029"/>
+          <w:numId w:val="1026"/>
         </w:numPr>
       </w:pPr>
       <w:r>
@@ -1906,7 +1537,7 @@
         <w:pStyle w:val="Compact"/>
         <w:numPr>
           <w:ilvl w:val="1"/>
-          <w:numId w:val="1029"/>
+          <w:numId w:val="1026"/>
         </w:numPr>
       </w:pPr>
       <w:r>
@@ -1918,7 +1549,7 @@
         <w:pStyle w:val="Compact"/>
         <w:numPr>
           <w:ilvl w:val="1"/>
-          <w:numId w:val="1029"/>
+          <w:numId w:val="1026"/>
         </w:numPr>
       </w:pPr>
       <w:r>
@@ -1927,7 +1558,7 @@
       <w:r>
         <w:t xml:space="preserve"> </w:t>
       </w:r>
-      <w:hyperlink r:id="rId61">
+      <w:hyperlink r:id="rId48">
         <w:r>
           <w:rPr>
             <w:rStyle w:val="Hyperlink"/>
@@ -1936,8 +1567,8 @@
         </w:r>
       </w:hyperlink>
     </w:p>
-    <w:bookmarkEnd w:id="62"/>
-    <w:bookmarkStart w:id="64" w:name="generative-ai-use-in-ge-2021"/>
+    <w:bookmarkEnd w:id="49"/>
+    <w:bookmarkStart w:id="51" w:name="generative-ai-use-in-ge-2021"/>
     <w:p>
       <w:pPr>
         <w:pStyle w:val="Heading2"/>
@@ -1951,15 +1582,15 @@
         <w:pStyle w:val="FirstParagraph"/>
       </w:pPr>
       <w:r>
-        <w:t xml:space="preserve">Students in GE 202X are permitted to use AI tools, including, but not limited to, ChatGhT, in this course to generate ideas and brainstorm.</w:t>
-      </w:r>
-    </w:p>
-    <w:p>
-      <w:pPr>
-        <w:pStyle w:val="Compact"/>
-        <w:numPr>
-          <w:ilvl w:val="0"/>
-          <w:numId w:val="1030"/>
+        <w:t xml:space="preserve">Students in GE 2021 are permitted to use AI tools, including, but not limited to, ChatGPT, in this course to generate ideas and brainstorm.</w:t>
+      </w:r>
+    </w:p>
+    <w:p>
+      <w:pPr>
+        <w:pStyle w:val="Compact"/>
+        <w:numPr>
+          <w:ilvl w:val="0"/>
+          <w:numId w:val="1027"/>
         </w:numPr>
       </w:pPr>
       <w:r>
@@ -1977,7 +1608,7 @@
         <w:pStyle w:val="Compact"/>
         <w:numPr>
           <w:ilvl w:val="0"/>
-          <w:numId w:val="1030"/>
+          <w:numId w:val="1027"/>
         </w:numPr>
       </w:pPr>
       <w:r>
@@ -1996,7 +1627,7 @@
         <w:pStyle w:val="Compact"/>
         <w:numPr>
           <w:ilvl w:val="0"/>
-          <w:numId w:val="1031"/>
+          <w:numId w:val="1028"/>
         </w:numPr>
       </w:pPr>
       <w:r>
@@ -2008,23 +1639,23 @@
         <w:pStyle w:val="Compact"/>
         <w:numPr>
           <w:ilvl w:val="0"/>
-          <w:numId w:val="1031"/>
-        </w:numPr>
-      </w:pPr>
-      <w:r>
-        <w:t xml:space="preserve">Students should never submit Al-generated work as their original work, as this would constitute a plagiarism violation as defined by the University Academic Integrity Policy and subject to appropriate sanctions.</w:t>
-      </w:r>
-    </w:p>
-    <w:p>
-      <w:pPr>
-        <w:pStyle w:val="Compact"/>
-        <w:numPr>
-          <w:ilvl w:val="0"/>
-          <w:numId w:val="1031"/>
-        </w:numPr>
-      </w:pPr>
-      <w:r>
-        <w:t xml:space="preserve">The inclusion of Al generated material must always be cited appropriately, like any other reference material.</w:t>
+          <w:numId w:val="1028"/>
+        </w:numPr>
+      </w:pPr>
+      <w:r>
+        <w:t xml:space="preserve">Students should never submit AI-generated work as their original work, as this would constitute a plagiarism violation as defined by the University Academic Integrity Policy and subject to appropriate sanctions.</w:t>
+      </w:r>
+    </w:p>
+    <w:p>
+      <w:pPr>
+        <w:pStyle w:val="Compact"/>
+        <w:numPr>
+          <w:ilvl w:val="0"/>
+          <w:numId w:val="1028"/>
+        </w:numPr>
+      </w:pPr>
+      <w:r>
+        <w:t xml:space="preserve">The inclusion of AI generated material must always be cited appropriately, like any other reference material.</w:t>
       </w:r>
     </w:p>
     <w:p>
@@ -2039,16 +1670,16 @@
         <w:pStyle w:val="Compact"/>
         <w:numPr>
           <w:ilvl w:val="0"/>
-          <w:numId w:val="1032"/>
-        </w:numPr>
-      </w:pPr>
-      <w:r>
-        <w:t xml:space="preserve">Using an Al tool to generate content without proper attribution qualifies as academic dishonesty. Additionally, be aware that information derived from these tools is often incomplete or inaccurate.</w:t>
+          <w:numId w:val="1029"/>
+        </w:numPr>
+      </w:pPr>
+      <w:r>
+        <w:t xml:space="preserve">Using an AI tool to generate content without proper attribution qualifies as academic dishonesty. Additionally, be aware that information derived from these tools is often incomplete or inaccurate.</w:t>
       </w:r>
       <w:r>
         <w:t xml:space="preserve"> </w:t>
       </w:r>
-      <w:hyperlink r:id="rId63">
+      <w:hyperlink r:id="rId50">
         <w:r>
           <w:rPr>
             <w:rStyle w:val="Hyperlink"/>
@@ -2062,23 +1693,23 @@
         <w:pStyle w:val="Compact"/>
         <w:numPr>
           <w:ilvl w:val="0"/>
-          <w:numId w:val="1032"/>
-        </w:numPr>
-      </w:pPr>
-      <w:r>
-        <w:t xml:space="preserve">Any assignment found to have been plagiarized or to have used unauthorized Al tools may receive a zero and/or be reported. This underscores the serious consequences of misusing Al tools and the importance of using them responsibly.</w:t>
-      </w:r>
-    </w:p>
-    <w:p>
-      <w:pPr>
-        <w:pStyle w:val="Compact"/>
-        <w:numPr>
-          <w:ilvl w:val="0"/>
-          <w:numId w:val="1032"/>
-        </w:numPr>
-      </w:pPr>
-      <w:r>
-        <w:t xml:space="preserve">Any use of generative Al-programs such as ChatGPT, GPT 4, DALL-E, Vertex, and many others to come—is subject to the same citation rules as ideas, text, speech, or imagery derived from human authors.</w:t>
+          <w:numId w:val="1029"/>
+        </w:numPr>
+      </w:pPr>
+      <w:r>
+        <w:t xml:space="preserve">Any assignment found to have been plagiarized or to have used unauthorized AI tools may receive a zero and/or be reported. This underscores the serious consequences of misusing AI tools and the importance of using them responsibly.</w:t>
+      </w:r>
+    </w:p>
+    <w:p>
+      <w:pPr>
+        <w:pStyle w:val="Compact"/>
+        <w:numPr>
+          <w:ilvl w:val="0"/>
+          <w:numId w:val="1029"/>
+        </w:numPr>
+      </w:pPr>
+      <w:r>
+        <w:t xml:space="preserve">Any use of generative AI-programs such as ChatGPT, GPT 4, DALL-E, Vertex, and many others to come—is subject to the same citation rules as ideas, text, speech, or imagery derived from human authors.</w:t>
       </w:r>
     </w:p>
     <w:p>
@@ -2093,28 +1724,32 @@
         <w:pStyle w:val="Compact"/>
         <w:numPr>
           <w:ilvl w:val="0"/>
-          <w:numId w:val="1033"/>
-        </w:numPr>
-      </w:pPr>
-      <w:r>
-        <w:t xml:space="preserve">Any student who is unsure of expectations regarding generative Al tools is encouraged to ask their instructor for clarification.</w:t>
-      </w:r>
-    </w:p>
-    <w:p>
-      <w:pPr>
-        <w:pStyle w:val="Compact"/>
-        <w:numPr>
-          <w:ilvl w:val="0"/>
-          <w:numId w:val="1033"/>
+          <w:numId w:val="1030"/>
+        </w:numPr>
+      </w:pPr>
+      <w:r>
+        <w:t xml:space="preserve">Any student who is unsure of expectations regarding generative AI tools is encouraged to ask their instructor for clarification.</w:t>
+      </w:r>
+    </w:p>
+    <w:p>
+      <w:pPr>
+        <w:pStyle w:val="Compact"/>
+        <w:numPr>
+          <w:ilvl w:val="0"/>
+          <w:numId w:val="1030"/>
         </w:numPr>
       </w:pPr>
       <w:r>
         <w:t xml:space="preserve">This course only accepts 0-10% AI-generated writing in any assignment submission. Any student who submits an assignment with more than 10% AI-generated writing will be asked to revise the work. Failure to make the necessary revisions will result in a no grade failure on those assignments.</w:t>
       </w:r>
     </w:p>
-    <w:bookmarkEnd w:id="64"/>
-    <w:bookmarkEnd w:id="65"/>
-    <w:sectPr/>
+    <w:bookmarkEnd w:id="51"/>
+    <w:bookmarkEnd w:id="52"/>
+    <w:sectPr>
+      <w:footnotePr>
+        <w:numRestart w:val="eachSect"/>
+      </w:footnotePr>
+    </w:sectPr>
   </w:body>
 </w:document>
 </file>
@@ -2457,13 +2092,94 @@
     <w:abstractNumId w:val="991"/>
   </w:num>
   <w:num w:numId="1007">
-    <w:abstractNumId w:val="991"/>
+    <w:abstractNumId w:val="99411"/>
+    <w:lvlOverride w:ilvl="0">
+      <w:startOverride w:val="1"/>
+    </w:lvlOverride>
+    <w:lvlOverride w:ilvl="1">
+      <w:startOverride w:val="1"/>
+    </w:lvlOverride>
+    <w:lvlOverride w:ilvl="2">
+      <w:startOverride w:val="1"/>
+    </w:lvlOverride>
+    <w:lvlOverride w:ilvl="3">
+      <w:startOverride w:val="1"/>
+    </w:lvlOverride>
+    <w:lvlOverride w:ilvl="4">
+      <w:startOverride w:val="1"/>
+    </w:lvlOverride>
+    <w:lvlOverride w:ilvl="5">
+      <w:startOverride w:val="1"/>
+    </w:lvlOverride>
+    <w:lvlOverride w:ilvl="6">
+      <w:startOverride w:val="1"/>
+    </w:lvlOverride>
+    <w:lvlOverride w:ilvl="7">
+      <w:startOverride w:val="1"/>
+    </w:lvlOverride>
+    <w:lvlOverride w:ilvl="8">
+      <w:startOverride w:val="1"/>
+    </w:lvlOverride>
   </w:num>
   <w:num w:numId="1008">
-    <w:abstractNumId w:val="991"/>
+    <w:abstractNumId w:val="99411"/>
+    <w:lvlOverride w:ilvl="0">
+      <w:startOverride w:val="1"/>
+    </w:lvlOverride>
+    <w:lvlOverride w:ilvl="1">
+      <w:startOverride w:val="1"/>
+    </w:lvlOverride>
+    <w:lvlOverride w:ilvl="2">
+      <w:startOverride w:val="1"/>
+    </w:lvlOverride>
+    <w:lvlOverride w:ilvl="3">
+      <w:startOverride w:val="1"/>
+    </w:lvlOverride>
+    <w:lvlOverride w:ilvl="4">
+      <w:startOverride w:val="1"/>
+    </w:lvlOverride>
+    <w:lvlOverride w:ilvl="5">
+      <w:startOverride w:val="1"/>
+    </w:lvlOverride>
+    <w:lvlOverride w:ilvl="6">
+      <w:startOverride w:val="1"/>
+    </w:lvlOverride>
+    <w:lvlOverride w:ilvl="7">
+      <w:startOverride w:val="1"/>
+    </w:lvlOverride>
+    <w:lvlOverride w:ilvl="8">
+      <w:startOverride w:val="1"/>
+    </w:lvlOverride>
   </w:num>
   <w:num w:numId="1009">
-    <w:abstractNumId w:val="991"/>
+    <w:abstractNumId w:val="99411"/>
+    <w:lvlOverride w:ilvl="0">
+      <w:startOverride w:val="1"/>
+    </w:lvlOverride>
+    <w:lvlOverride w:ilvl="1">
+      <w:startOverride w:val="1"/>
+    </w:lvlOverride>
+    <w:lvlOverride w:ilvl="2">
+      <w:startOverride w:val="1"/>
+    </w:lvlOverride>
+    <w:lvlOverride w:ilvl="3">
+      <w:startOverride w:val="1"/>
+    </w:lvlOverride>
+    <w:lvlOverride w:ilvl="4">
+      <w:startOverride w:val="1"/>
+    </w:lvlOverride>
+    <w:lvlOverride w:ilvl="5">
+      <w:startOverride w:val="1"/>
+    </w:lvlOverride>
+    <w:lvlOverride w:ilvl="6">
+      <w:startOverride w:val="1"/>
+    </w:lvlOverride>
+    <w:lvlOverride w:ilvl="7">
+      <w:startOverride w:val="1"/>
+    </w:lvlOverride>
+    <w:lvlOverride w:ilvl="8">
+      <w:startOverride w:val="1"/>
+    </w:lvlOverride>
   </w:num>
   <w:num w:numId="1010">
     <w:abstractNumId w:val="99411"/>
@@ -2796,94 +2512,13 @@
     </w:lvlOverride>
   </w:num>
   <w:num w:numId="1021">
-    <w:abstractNumId w:val="99411"/>
-    <w:lvlOverride w:ilvl="0">
-      <w:startOverride w:val="1"/>
-    </w:lvlOverride>
-    <w:lvlOverride w:ilvl="1">
-      <w:startOverride w:val="1"/>
-    </w:lvlOverride>
-    <w:lvlOverride w:ilvl="2">
-      <w:startOverride w:val="1"/>
-    </w:lvlOverride>
-    <w:lvlOverride w:ilvl="3">
-      <w:startOverride w:val="1"/>
-    </w:lvlOverride>
-    <w:lvlOverride w:ilvl="4">
-      <w:startOverride w:val="1"/>
-    </w:lvlOverride>
-    <w:lvlOverride w:ilvl="5">
-      <w:startOverride w:val="1"/>
-    </w:lvlOverride>
-    <w:lvlOverride w:ilvl="6">
-      <w:startOverride w:val="1"/>
-    </w:lvlOverride>
-    <w:lvlOverride w:ilvl="7">
-      <w:startOverride w:val="1"/>
-    </w:lvlOverride>
-    <w:lvlOverride w:ilvl="8">
-      <w:startOverride w:val="1"/>
-    </w:lvlOverride>
+    <w:abstractNumId w:val="991"/>
   </w:num>
   <w:num w:numId="1022">
-    <w:abstractNumId w:val="99411"/>
-    <w:lvlOverride w:ilvl="0">
-      <w:startOverride w:val="1"/>
-    </w:lvlOverride>
-    <w:lvlOverride w:ilvl="1">
-      <w:startOverride w:val="1"/>
-    </w:lvlOverride>
-    <w:lvlOverride w:ilvl="2">
-      <w:startOverride w:val="1"/>
-    </w:lvlOverride>
-    <w:lvlOverride w:ilvl="3">
-      <w:startOverride w:val="1"/>
-    </w:lvlOverride>
-    <w:lvlOverride w:ilvl="4">
-      <w:startOverride w:val="1"/>
-    </w:lvlOverride>
-    <w:lvlOverride w:ilvl="5">
-      <w:startOverride w:val="1"/>
-    </w:lvlOverride>
-    <w:lvlOverride w:ilvl="6">
-      <w:startOverride w:val="1"/>
-    </w:lvlOverride>
-    <w:lvlOverride w:ilvl="7">
-      <w:startOverride w:val="1"/>
-    </w:lvlOverride>
-    <w:lvlOverride w:ilvl="8">
-      <w:startOverride w:val="1"/>
-    </w:lvlOverride>
+    <w:abstractNumId w:val="991"/>
   </w:num>
   <w:num w:numId="1023">
-    <w:abstractNumId w:val="99411"/>
-    <w:lvlOverride w:ilvl="0">
-      <w:startOverride w:val="1"/>
-    </w:lvlOverride>
-    <w:lvlOverride w:ilvl="1">
-      <w:startOverride w:val="1"/>
-    </w:lvlOverride>
-    <w:lvlOverride w:ilvl="2">
-      <w:startOverride w:val="1"/>
-    </w:lvlOverride>
-    <w:lvlOverride w:ilvl="3">
-      <w:startOverride w:val="1"/>
-    </w:lvlOverride>
-    <w:lvlOverride w:ilvl="4">
-      <w:startOverride w:val="1"/>
-    </w:lvlOverride>
-    <w:lvlOverride w:ilvl="5">
-      <w:startOverride w:val="1"/>
-    </w:lvlOverride>
-    <w:lvlOverride w:ilvl="6">
-      <w:startOverride w:val="1"/>
-    </w:lvlOverride>
-    <w:lvlOverride w:ilvl="7">
-      <w:startOverride w:val="1"/>
-    </w:lvlOverride>
-    <w:lvlOverride w:ilvl="8">
-      <w:startOverride w:val="1"/>
-    </w:lvlOverride>
+    <w:abstractNumId w:val="991"/>
   </w:num>
   <w:num w:numId="1024">
     <w:abstractNumId w:val="991"/>
@@ -2906,15 +2541,6 @@
   <w:num w:numId="1030">
     <w:abstractNumId w:val="991"/>
   </w:num>
-  <w:num w:numId="1031">
-    <w:abstractNumId w:val="991"/>
-  </w:num>
-  <w:num w:numId="1032">
-    <w:abstractNumId w:val="991"/>
-  </w:num>
-  <w:num w:numId="1033">
-    <w:abstractNumId w:val="991"/>
-  </w:num>
 </w:numbering>
 </file>
 
@@ -2978,8 +2604,6 @@
     </w:pPr>
     <w:rPr>
       <w:rFonts w:asciiTheme="majorHAnsi" w:cstheme="majorBidi" w:eastAsiaTheme="majorEastAsia" w:hAnsiTheme="majorHAnsi"/>
-      <w:spacing w:val="-10"/>
-      <w:kern w:val="28"/>
       <w:sz w:val="56"/>
       <w:szCs w:val="56"/>
     </w:rPr>
@@ -2992,8 +2616,6 @@
     <w:rsid w:val="00A10FD9"/>
     <w:rPr>
       <w:rFonts w:asciiTheme="majorHAnsi" w:cstheme="majorBidi" w:eastAsiaTheme="majorEastAsia" w:hAnsiTheme="majorHAnsi"/>
-      <w:spacing w:val="-10"/>
-      <w:kern w:val="28"/>
       <w:sz w:val="56"/>
       <w:szCs w:val="56"/>
     </w:rPr>
@@ -3034,23 +2656,31 @@
   </w:style>
   <w:style w:customStyle="1" w:styleId="Author" w:type="paragraph">
     <w:name w:val="Author"/>
+    <w:basedOn w:val="Title"/>
     <w:next w:val="BodyText"/>
     <w:qFormat/>
     <w:pPr>
       <w:keepNext/>
       <w:keepLines/>
-      <w:jc w:val="center"/>
     </w:pPr>
+    <w:rPr>
+      <w:sz w:val="24"/>
+      <w:szCs w:val="24"/>
+    </w:rPr>
   </w:style>
   <w:style w:styleId="Date" w:type="paragraph">
     <w:name w:val="Date"/>
+    <w:basedOn w:val="Title"/>
     <w:next w:val="BodyText"/>
     <w:qFormat/>
     <w:pPr>
       <w:keepNext/>
       <w:keepLines/>
-      <w:jc w:val="center"/>
     </w:pPr>
+    <w:rPr>
+      <w:sz w:val="24"/>
+      <w:szCs w:val="24"/>
+    </w:rPr>
   </w:style>
   <w:style w:customStyle="1" w:styleId="AbstractTitle" w:type="paragraph">
     <w:name w:val="Abstract Title"/>

</xml_diff>